<commit_message>
Enhance governance risk assessment and documentation for ServiceNow integration
</commit_message>
<xml_diff>
--- a/docs/diagrams/OpsIntel_Diagram_Guide.docx
+++ b/docs/diagrams/OpsIntel_Diagram_Guide.docx
@@ -133,7 +133,7 @@
         <w:t xml:space="preserve">Data notice:</w:t>
       </w:r>
       <w:r>
-        <w:t xml:space="preserve"> every figure in this guide comes from the synthetic data set (fictional company, seed 42, snapshot 30 September 2026). Nothing describes a real organisation.</w:t>
+        <w:t xml:space="preserve"> figures on pages 1-9 come from the synthetic data set (fictional company, seed 42, snapshot 30 September 2026). Page 10 figures come from a ServiceNow developer instance (ServiceNow demo records plus history seeded by this project). Nothing describes a real organisation.</w:t>
       </w:r>
     </w:p>
     <w:p>
@@ -190,7 +190,7 @@
         <w:spacing w:after="120" w:line="276"/>
       </w:pPr>
       <w:r>
-        <w:t xml:space="preserve">The file contains nine pages, shown as tabs along the bottom of draw.io. Each page answers one question about the design. The pages use the same visual language throughout, so once you know the conventions below you can read any page.</w:t>
+        <w:t xml:space="preserve">The file contains ten pages, shown as tabs along the bottom of draw.io. Each page answers one question about the design. The pages use the same visual language throughout, so once you know the conventions below you can read any page.</w:t>
       </w:r>
     </w:p>
     <w:p>
@@ -1751,7 +1751,7 @@
                 <w:sz w:val="20"/>
                 <w:szCs w:val="20"/>
               </w:rPr>
-              <w:t xml:space="preserve">The one idea that runs through all nine pages</w:t>
+              <w:t xml:space="preserve">The one idea that runs through all ten pages</w:t>
             </w:r>
           </w:p>
           <w:p>
@@ -1954,7 +1954,7 @@
                 <w:sz w:val="19"/>
                 <w:szCs w:val="19"/>
               </w:rPr>
-              <w:t xml:space="preserve">CMDB (relational DB)</w:t>
+              <w:t xml:space="preserve">CMDB (relational DB or live ServiceNow)</w:t>
             </w:r>
           </w:p>
         </w:tc>
@@ -1985,7 +1985,7 @@
                 <w:sz w:val="19"/>
                 <w:szCs w:val="19"/>
               </w:rPr>
-              <w:t xml:space="preserve">Configuration management database holding business units, services (with alternative names), customers, assets/configuration items and SLA definitions. In the MVP it is a separate SQLite file (</w:t>
+              <w:t xml:space="preserve">Configuration management database holding business units, services (with alternative names), customers, assets/configuration items and SLA definitions. In synthetic mode it is a separate SQLite file (</w:t>
             </w:r>
             <w:r>
               <w:rPr>
@@ -2085,7 +2085,7 @@
                 <w:sz w:val="19"/>
                 <w:szCs w:val="19"/>
               </w:rPr>
-              <w:t xml:space="preserve">).</w:t>
+              <w:t xml:space="preserve">). In live mode the same tables are read from a ServiceNow instance (page 10).</w:t>
             </w:r>
           </w:p>
         </w:tc>
@@ -2190,7 +2190,7 @@
                 <w:sz w:val="19"/>
                 <w:szCs w:val="19"/>
               </w:rPr>
-              <w:t xml:space="preserve">ITSM exports (CSV)</w:t>
+              <w:t xml:space="preserve">ITSM (CSV or live ServiceNow)</w:t>
             </w:r>
           </w:p>
         </w:tc>
@@ -2222,7 +2222,7 @@
                 <w:sz w:val="19"/>
                 <w:szCs w:val="19"/>
               </w:rPr>
-              <w:t xml:space="preserve">Incident and service-request exports, as a ServiceNow/Halo report would produce. 7,680 incident rows and 4,244 request rows arrive, including deliberate defects: duplicates, stale versions, two date formats, misspelled service names, missing priorities, test tickets, impossible timestamps and orphan customers.</w:t>
+              <w:t xml:space="preserve">Incident and service-request records. In synthetic mode they arrive as exports, as a ServiceNow/Halo report would produce; in live mode they are read from the ServiceNow Table API with OAuth (page 10). 7,680 incident rows and 4,244 request rows arrive, including deliberate defects: duplicates, stale versions, two date formats, misspelled service names, missing priorities, test tickets, impossible timestamps and orphan customers.</w:t>
             </w:r>
           </w:p>
         </w:tc>
@@ -2852,7 +2852,7 @@
                 <w:sz w:val="19"/>
                 <w:szCs w:val="19"/>
               </w:rPr>
-              <w:t xml:space="preserve">Three connector types: CSV (read everything as text), relational (read-only SQL), REST (follows </w:t>
+              <w:t xml:space="preserve">Four connector types: CSV (read everything as text), relational (read-only SQL), REST (follows </w:t>
             </w:r>
             <w:r>
               <w:rPr>
@@ -2872,7 +2872,7 @@
                 <w:sz w:val="19"/>
                 <w:szCs w:val="19"/>
               </w:rPr>
-              <w:t xml:space="preserve"> until done). Each returns the data plus provenance: source URI and SHA-256 hash.</w:t>
+              <w:t xml:space="preserve"> until done), and ServiceNow (Table API, OAuth 2.0 client credentials, GET-only, lands into the same raw format). Each returns the data plus provenance: source URI and SHA-256 hash.</w:t>
             </w:r>
           </w:p>
         </w:tc>
@@ -26122,7 +26122,7 @@
                 <w:sz w:val="19"/>
                 <w:szCs w:val="19"/>
               </w:rPr>
-              <w:t xml:space="preserve">One artefact, one set of dependencies, no drift between UI and API. Non-root reduces the impact of a container compromise. All 54 tests pass inside the built image.</w:t>
+              <w:t xml:space="preserve">One artefact, one set of dependencies, no drift between UI and API. Non-root reduces the impact of a container compromise. All 62 tests pass inside the built image, and the git-ignored .env file with source credentials is excluded from it.</w:t>
             </w:r>
           </w:p>
         </w:tc>
@@ -26475,6 +26475,123 @@
                 <w:sz w:val="19"/>
                 <w:szCs w:val="19"/>
               </w:rPr>
+              <w:t xml:space="preserve">ServiceNow instance</w:t>
+            </w:r>
+          </w:p>
+        </w:tc>
+        <w:tc>
+          <w:tcPr>
+            <w:tcW w:type="dxa" w:w="3760"/>
+            <w:tcBorders>
+              <w:top w:val="single" w:color="BFBFBF" w:sz="4"/>
+              <w:left w:val="single" w:color="BFBFBF" w:sz="4"/>
+              <w:bottom w:val="single" w:color="BFBFBF" w:sz="4"/>
+              <w:right w:val="single" w:color="BFBFBF" w:sz="4"/>
+            </w:tcBorders>
+            <w:shd w:fill="F4F6FA" w:color="auto" w:val="clear"/>
+            <w:tcMar>
+              <w:top w:type="dxa" w:w="70"/>
+              <w:left w:type="dxa" w:w="110"/>
+              <w:bottom w:type="dxa" w:w="70"/>
+              <w:right w:type="dxa" w:w="110"/>
+            </w:tcMar>
+          </w:tcPr>
+          <w:p>
+            <w:pPr>
+              <w:spacing w:after="40" w:line="252"/>
+            </w:pPr>
+            <w:r>
+              <w:rPr>
+                <w:b w:val="false"/>
+                <w:bCs w:val="false"/>
+                <w:sz w:val="19"/>
+                <w:szCs w:val="19"/>
+              </w:rPr>
+              <w:t xml:space="preserve">The live source system, reached by </w:t>
+            </w:r>
+            <w:r>
+              <w:rPr>
+                <w:rFonts w:ascii="Consolas" w:cs="Consolas" w:eastAsia="Consolas" w:hAnsi="Consolas"/>
+                <w:b w:val="false"/>
+                <w:bCs w:val="false"/>
+                <w:color w:val="8B2E2E"/>
+                <w:sz w:val="19"/>
+                <w:szCs w:val="19"/>
+              </w:rPr>
+              <w:t xml:space="preserve">make sn-sync</w:t>
+            </w:r>
+            <w:r>
+              <w:rPr>
+                <w:b w:val="false"/>
+                <w:bCs w:val="false"/>
+                <w:sz w:val="19"/>
+                <w:szCs w:val="19"/>
+              </w:rPr>
+              <w:t xml:space="preserve"> through the Table API with OAuth client credentials (dashed arrow from the image).</w:t>
+            </w:r>
+          </w:p>
+        </w:tc>
+        <w:tc>
+          <w:tcPr>
+            <w:tcW w:type="dxa" w:w="3386"/>
+            <w:tcBorders>
+              <w:top w:val="single" w:color="BFBFBF" w:sz="4"/>
+              <w:left w:val="single" w:color="BFBFBF" w:sz="4"/>
+              <w:bottom w:val="single" w:color="BFBFBF" w:sz="4"/>
+              <w:right w:val="single" w:color="BFBFBF" w:sz="4"/>
+            </w:tcBorders>
+            <w:shd w:fill="F4F6FA" w:color="auto" w:val="clear"/>
+            <w:tcMar>
+              <w:top w:type="dxa" w:w="70"/>
+              <w:left w:type="dxa" w:w="110"/>
+              <w:bottom w:type="dxa" w:w="70"/>
+              <w:right w:type="dxa" w:w="110"/>
+            </w:tcMar>
+          </w:tcPr>
+          <w:p>
+            <w:pPr>
+              <w:spacing w:after="40" w:line="252"/>
+            </w:pPr>
+            <w:r>
+              <w:rPr>
+                <w:b w:val="false"/>
+                <w:bCs w:val="false"/>
+                <w:sz w:val="19"/>
+                <w:szCs w:val="19"/>
+              </w:rPr>
+              <w:t xml:space="preserve">External and read-only: the connector only reads; credentials come from the environment, not the image.</w:t>
+            </w:r>
+          </w:p>
+        </w:tc>
+      </w:tr>
+      <w:tr>
+        <w:tc>
+          <w:tcPr>
+            <w:tcW w:type="dxa" w:w="1880"/>
+            <w:tcBorders>
+              <w:top w:val="single" w:color="BFBFBF" w:sz="4"/>
+              <w:left w:val="single" w:color="BFBFBF" w:sz="4"/>
+              <w:bottom w:val="single" w:color="BFBFBF" w:sz="4"/>
+              <w:right w:val="single" w:color="BFBFBF" w:sz="4"/>
+            </w:tcBorders>
+            <w:tcMar>
+              <w:top w:type="dxa" w:w="70"/>
+              <w:left w:type="dxa" w:w="110"/>
+              <w:bottom w:type="dxa" w:w="70"/>
+              <w:right w:type="dxa" w:w="110"/>
+            </w:tcMar>
+          </w:tcPr>
+          <w:p>
+            <w:pPr>
+              <w:spacing w:after="40" w:line="252"/>
+            </w:pPr>
+            <w:r>
+              <w:rPr>
+                <w:b/>
+                <w:bCs/>
+                <w:sz w:val="19"/>
+                <w:szCs w:val="19"/>
+              </w:rPr>
               <w:t xml:space="preserve">GitHub Actions CI</w:t>
             </w:r>
           </w:p>
@@ -26488,26 +26605,25 @@
               <w:bottom w:val="single" w:color="BFBFBF" w:sz="4"/>
               <w:right w:val="single" w:color="BFBFBF" w:sz="4"/>
             </w:tcBorders>
-            <w:shd w:fill="F4F6FA" w:color="auto" w:val="clear"/>
-            <w:tcMar>
-              <w:top w:type="dxa" w:w="70"/>
-              <w:left w:type="dxa" w:w="110"/>
-              <w:bottom w:type="dxa" w:w="70"/>
-              <w:right w:type="dxa" w:w="110"/>
-            </w:tcMar>
-          </w:tcPr>
-          <w:p>
-            <w:pPr>
-              <w:spacing w:after="40" w:line="252"/>
-            </w:pPr>
-            <w:r>
-              <w:rPr>
-                <w:b w:val="false"/>
-                <w:bCs w:val="false"/>
-                <w:sz w:val="19"/>
-                <w:szCs w:val="19"/>
-              </w:rPr>
-              <w:t xml:space="preserve">On every push: setup → pytest → evaluation (rules engine) → upload the evaluation report.</w:t>
+            <w:tcMar>
+              <w:top w:type="dxa" w:w="70"/>
+              <w:left w:type="dxa" w:w="110"/>
+              <w:bottom w:type="dxa" w:w="70"/>
+              <w:right w:type="dxa" w:w="110"/>
+            </w:tcMar>
+          </w:tcPr>
+          <w:p>
+            <w:pPr>
+              <w:spacing w:after="40" w:line="252"/>
+            </w:pPr>
+            <w:r>
+              <w:rPr>
+                <w:b w:val="false"/>
+                <w:bCs w:val="false"/>
+                <w:sz w:val="19"/>
+                <w:szCs w:val="19"/>
+              </w:rPr>
+              <w:t xml:space="preserve">On every push: setup → pytest (62 tests) → evaluation (rules engine) → upload the evaluation report.</w:t>
             </w:r>
           </w:p>
         </w:tc>
@@ -26520,7 +26636,6 @@
               <w:bottom w:val="single" w:color="BFBFBF" w:sz="4"/>
               <w:right w:val="single" w:color="BFBFBF" w:sz="4"/>
             </w:tcBorders>
-            <w:shd w:fill="F4F6FA" w:color="auto" w:val="clear"/>
             <w:tcMar>
               <w:top w:type="dxa" w:w="70"/>
               <w:left w:type="dxa" w:w="110"/>
@@ -27475,7 +27590,7 @@
         <w:t xml:space="preserve">X-User</w:t>
       </w:r>
       <w:r>
-        <w:t xml:space="preserve"> header → Entra ID OIDC group claims; CSV drops → ServiceNow Table API, incremental by </w:t>
+        <w:t xml:space="preserve"> header → Entra ID OIDC group claims; the existing ServiceNow connector → a scheduled incremental sync by </w:t>
       </w:r>
       <w:r>
         <w:rPr>
@@ -27487,7 +27602,7 @@
         <w:t xml:space="preserve">sys_updated_on</w:t>
       </w:r>
       <w:r>
-        <w:t xml:space="preserve">.</w:t>
+        <w:t xml:space="preserve">, with secrets from a vault.</w:t>
       </w:r>
     </w:p>
     <w:p>
@@ -30242,6 +30357,3124 @@
         <w:pageBreakBefore/>
       </w:pPr>
       <w:r>
+        <w:t xml:space="preserve">Page 10 - Live ServiceNow integration</w:t>
+      </w:r>
+    </w:p>
+    <w:p>
+      <w:pPr>
+        <w:spacing w:after="120" w:line="276"/>
+      </w:pPr>
+      <w:r>
+        <w:rPr>
+          <w:b/>
+          <w:bCs/>
+        </w:rPr>
+        <w:t xml:space="preserve">Question this page answers:</w:t>
+      </w:r>
+      <w:r>
+        <w:t xml:space="preserve"> how does OpsIntel read a real ServiceNow instance, what had to be configured, and what did a real instance teach us?</w:t>
+      </w:r>
+    </w:p>
+    <w:p>
+      <w:pPr>
+        <w:spacing w:after="120" w:line="276"/>
+      </w:pPr>
+      <w:r>
+        <w:t xml:space="preserve">Three columns: the one-off configuration an administrator does in the instance (left, blue), what happens each time the connector runs (middle, green), and the problems a real instance raised with how each was solved (right, grey). The two wide boxes at the bottom are the demo-data tools and the measured result.</w:t>
+      </w:r>
+    </w:p>
+    <w:p>
+      <w:pPr>
+        <w:pStyle w:val="Heading2"/>
+      </w:pPr>
+      <w:r>
+        <w:t xml:space="preserve">Left - configuration in the instance</w:t>
+      </w:r>
+    </w:p>
+    <w:tbl>
+      <w:tblPr>
+        <w:tblW w:type="dxa" w:w="9026"/>
+        <w:tblBorders>
+          <w:top w:val="single" w:color="auto" w:sz="4"/>
+          <w:left w:val="single" w:color="auto" w:sz="4"/>
+          <w:bottom w:val="single" w:color="auto" w:sz="4"/>
+          <w:right w:val="single" w:color="auto" w:sz="4"/>
+          <w:insideH w:val="single" w:color="auto" w:sz="4"/>
+          <w:insideV w:val="single" w:color="auto" w:sz="4"/>
+        </w:tblBorders>
+      </w:tblPr>
+      <w:tblGrid>
+        <w:gridCol w:w="1880"/>
+        <w:gridCol w:w="3760"/>
+        <w:gridCol w:w="3386"/>
+      </w:tblGrid>
+      <w:tr>
+        <w:trPr>
+          <w:tblHeader/>
+        </w:trPr>
+        <w:tc>
+          <w:tcPr>
+            <w:tcW w:type="dxa" w:w="1880"/>
+            <w:tcBorders>
+              <w:top w:val="single" w:color="BFBFBF" w:sz="4"/>
+              <w:left w:val="single" w:color="BFBFBF" w:sz="4"/>
+              <w:bottom w:val="single" w:color="BFBFBF" w:sz="4"/>
+              <w:right w:val="single" w:color="BFBFBF" w:sz="4"/>
+            </w:tcBorders>
+            <w:shd w:fill="1F3864" w:color="auto" w:val="clear"/>
+            <w:tcMar>
+              <w:top w:type="dxa" w:w="70"/>
+              <w:left w:type="dxa" w:w="110"/>
+              <w:bottom w:type="dxa" w:w="70"/>
+              <w:right w:type="dxa" w:w="110"/>
+            </w:tcMar>
+          </w:tcPr>
+          <w:p>
+            <w:r>
+              <w:rPr>
+                <w:b/>
+                <w:bCs/>
+                <w:color w:val="FFFFFF"/>
+                <w:sz w:val="19"/>
+                <w:szCs w:val="19"/>
+              </w:rPr>
+              <w:t xml:space="preserve">Block</w:t>
+            </w:r>
+          </w:p>
+        </w:tc>
+        <w:tc>
+          <w:tcPr>
+            <w:tcW w:type="dxa" w:w="3760"/>
+            <w:tcBorders>
+              <w:top w:val="single" w:color="BFBFBF" w:sz="4"/>
+              <w:left w:val="single" w:color="BFBFBF" w:sz="4"/>
+              <w:bottom w:val="single" w:color="BFBFBF" w:sz="4"/>
+              <w:right w:val="single" w:color="BFBFBF" w:sz="4"/>
+            </w:tcBorders>
+            <w:shd w:fill="1F3864" w:color="auto" w:val="clear"/>
+            <w:tcMar>
+              <w:top w:type="dxa" w:w="70"/>
+              <w:left w:type="dxa" w:w="110"/>
+              <w:bottom w:type="dxa" w:w="70"/>
+              <w:right w:type="dxa" w:w="110"/>
+            </w:tcMar>
+          </w:tcPr>
+          <w:p>
+            <w:r>
+              <w:rPr>
+                <w:b/>
+                <w:bCs/>
+                <w:color w:val="FFFFFF"/>
+                <w:sz w:val="19"/>
+                <w:szCs w:val="19"/>
+              </w:rPr>
+              <w:t xml:space="preserve">What it is / what it does</w:t>
+            </w:r>
+          </w:p>
+        </w:tc>
+        <w:tc>
+          <w:tcPr>
+            <w:tcW w:type="dxa" w:w="3386"/>
+            <w:tcBorders>
+              <w:top w:val="single" w:color="BFBFBF" w:sz="4"/>
+              <w:left w:val="single" w:color="BFBFBF" w:sz="4"/>
+              <w:bottom w:val="single" w:color="BFBFBF" w:sz="4"/>
+              <w:right w:val="single" w:color="BFBFBF" w:sz="4"/>
+            </w:tcBorders>
+            <w:shd w:fill="1F3864" w:color="auto" w:val="clear"/>
+            <w:tcMar>
+              <w:top w:type="dxa" w:w="70"/>
+              <w:left w:type="dxa" w:w="110"/>
+              <w:bottom w:type="dxa" w:w="70"/>
+              <w:right w:type="dxa" w:w="110"/>
+            </w:tcMar>
+          </w:tcPr>
+          <w:p>
+            <w:r>
+              <w:rPr>
+                <w:b/>
+                <w:bCs/>
+                <w:color w:val="FFFFFF"/>
+                <w:sz w:val="19"/>
+                <w:szCs w:val="19"/>
+              </w:rPr>
+              <w:t xml:space="preserve">Design rationale &amp; where in the code</w:t>
+            </w:r>
+          </w:p>
+        </w:tc>
+      </w:tr>
+      <w:tr>
+        <w:tc>
+          <w:tcPr>
+            <w:tcW w:type="dxa" w:w="1880"/>
+            <w:tcBorders>
+              <w:top w:val="single" w:color="BFBFBF" w:sz="4"/>
+              <w:left w:val="single" w:color="BFBFBF" w:sz="4"/>
+              <w:bottom w:val="single" w:color="BFBFBF" w:sz="4"/>
+              <w:right w:val="single" w:color="BFBFBF" w:sz="4"/>
+            </w:tcBorders>
+            <w:tcMar>
+              <w:top w:type="dxa" w:w="70"/>
+              <w:left w:type="dxa" w:w="110"/>
+              <w:bottom w:type="dxa" w:w="70"/>
+              <w:right w:type="dxa" w:w="110"/>
+            </w:tcMar>
+          </w:tcPr>
+          <w:p>
+            <w:pPr>
+              <w:spacing w:after="40" w:line="252"/>
+            </w:pPr>
+            <w:r>
+              <w:rPr>
+                <w:b/>
+                <w:bCs/>
+                <w:sz w:val="19"/>
+                <w:szCs w:val="19"/>
+              </w:rPr>
+              <w:t xml:space="preserve">1 · Integration user</w:t>
+            </w:r>
+          </w:p>
+        </w:tc>
+        <w:tc>
+          <w:tcPr>
+            <w:tcW w:type="dxa" w:w="3760"/>
+            <w:tcBorders>
+              <w:top w:val="single" w:color="BFBFBF" w:sz="4"/>
+              <w:left w:val="single" w:color="BFBFBF" w:sz="4"/>
+              <w:bottom w:val="single" w:color="BFBFBF" w:sz="4"/>
+              <w:right w:val="single" w:color="BFBFBF" w:sz="4"/>
+            </w:tcBorders>
+            <w:tcMar>
+              <w:top w:type="dxa" w:w="70"/>
+              <w:left w:type="dxa" w:w="110"/>
+              <w:bottom w:type="dxa" w:w="70"/>
+              <w:right w:type="dxa" w:w="110"/>
+            </w:tcMar>
+          </w:tcPr>
+          <w:p>
+            <w:pPr>
+              <w:spacing w:after="40" w:line="252"/>
+            </w:pPr>
+            <w:r>
+              <w:rPr>
+                <w:rFonts w:ascii="Consolas" w:cs="Consolas" w:eastAsia="Consolas" w:hAnsi="Consolas"/>
+                <w:b w:val="false"/>
+                <w:bCs w:val="false"/>
+                <w:color w:val="8B2E2E"/>
+                <w:sz w:val="19"/>
+                <w:szCs w:val="19"/>
+              </w:rPr>
+              <w:t xml:space="preserve">opsintel.integration</w:t>
+            </w:r>
+            <w:r>
+              <w:rPr>
+                <w:b w:val="false"/>
+                <w:bCs w:val="false"/>
+                <w:sz w:val="19"/>
+                <w:szCs w:val="19"/>
+              </w:rPr>
+              <w:t xml:space="preserve"> with roles </w:t>
+            </w:r>
+            <w:r>
+              <w:rPr>
+                <w:rFonts w:ascii="Consolas" w:cs="Consolas" w:eastAsia="Consolas" w:hAnsi="Consolas"/>
+                <w:b w:val="false"/>
+                <w:bCs w:val="false"/>
+                <w:color w:val="8B2E2E"/>
+                <w:sz w:val="19"/>
+                <w:szCs w:val="19"/>
+              </w:rPr>
+              <w:t xml:space="preserve">itil</w:t>
+            </w:r>
+            <w:r>
+              <w:rPr>
+                <w:b w:val="false"/>
+                <w:bCs w:val="false"/>
+                <w:sz w:val="19"/>
+                <w:szCs w:val="19"/>
+              </w:rPr>
+              <w:t xml:space="preserve">, </w:t>
+            </w:r>
+            <w:r>
+              <w:rPr>
+                <w:rFonts w:ascii="Consolas" w:cs="Consolas" w:eastAsia="Consolas" w:hAnsi="Consolas"/>
+                <w:b w:val="false"/>
+                <w:bCs w:val="false"/>
+                <w:color w:val="8B2E2E"/>
+                <w:sz w:val="19"/>
+                <w:szCs w:val="19"/>
+              </w:rPr>
+              <w:t xml:space="preserve">cmdb_read</w:t>
+            </w:r>
+            <w:r>
+              <w:rPr>
+                <w:b w:val="false"/>
+                <w:bCs w:val="false"/>
+                <w:sz w:val="19"/>
+                <w:szCs w:val="19"/>
+              </w:rPr>
+              <w:t xml:space="preserve">, </w:t>
+            </w:r>
+            <w:r>
+              <w:rPr>
+                <w:rFonts w:ascii="Consolas" w:cs="Consolas" w:eastAsia="Consolas" w:hAnsi="Consolas"/>
+                <w:b w:val="false"/>
+                <w:bCs w:val="false"/>
+                <w:color w:val="8B2E2E"/>
+                <w:sz w:val="19"/>
+                <w:szCs w:val="19"/>
+              </w:rPr>
+              <w:t xml:space="preserve">snc_read_only</w:t>
+            </w:r>
+            <w:r>
+              <w:rPr>
+                <w:b w:val="false"/>
+                <w:bCs w:val="false"/>
+                <w:sz w:val="19"/>
+                <w:szCs w:val="19"/>
+              </w:rPr>
+              <w:t xml:space="preserve">, ticked *web service access only*.</w:t>
+            </w:r>
+          </w:p>
+        </w:tc>
+        <w:tc>
+          <w:tcPr>
+            <w:tcW w:type="dxa" w:w="3386"/>
+            <w:tcBorders>
+              <w:top w:val="single" w:color="BFBFBF" w:sz="4"/>
+              <w:left w:val="single" w:color="BFBFBF" w:sz="4"/>
+              <w:bottom w:val="single" w:color="BFBFBF" w:sz="4"/>
+              <w:right w:val="single" w:color="BFBFBF" w:sz="4"/>
+            </w:tcBorders>
+            <w:tcMar>
+              <w:top w:type="dxa" w:w="70"/>
+              <w:left w:type="dxa" w:w="110"/>
+              <w:bottom w:type="dxa" w:w="70"/>
+              <w:right w:type="dxa" w:w="110"/>
+            </w:tcMar>
+          </w:tcPr>
+          <w:p>
+            <w:pPr>
+              <w:spacing w:after="40" w:line="252"/>
+            </w:pPr>
+            <w:r>
+              <w:rPr>
+                <w:b w:val="false"/>
+                <w:bCs w:val="false"/>
+                <w:sz w:val="19"/>
+                <w:szCs w:val="19"/>
+              </w:rPr>
+              <w:t xml:space="preserve">Least privilege: it can read incidents, requests and the CMDB, cannot write anything (</w:t>
+            </w:r>
+            <w:r>
+              <w:rPr>
+                <w:rFonts w:ascii="Consolas" w:cs="Consolas" w:eastAsia="Consolas" w:hAnsi="Consolas"/>
+                <w:b w:val="false"/>
+                <w:bCs w:val="false"/>
+                <w:color w:val="8B2E2E"/>
+                <w:sz w:val="19"/>
+                <w:szCs w:val="19"/>
+              </w:rPr>
+              <w:t xml:space="preserve">snc_read_only</w:t>
+            </w:r>
+            <w:r>
+              <w:rPr>
+                <w:b w:val="false"/>
+                <w:bCs w:val="false"/>
+                <w:sz w:val="19"/>
+                <w:szCs w:val="19"/>
+              </w:rPr>
+              <w:t xml:space="preserve">) and cannot log in to the UI.</w:t>
+            </w:r>
+          </w:p>
+        </w:tc>
+      </w:tr>
+      <w:tr>
+        <w:tc>
+          <w:tcPr>
+            <w:tcW w:type="dxa" w:w="1880"/>
+            <w:tcBorders>
+              <w:top w:val="single" w:color="BFBFBF" w:sz="4"/>
+              <w:left w:val="single" w:color="BFBFBF" w:sz="4"/>
+              <w:bottom w:val="single" w:color="BFBFBF" w:sz="4"/>
+              <w:right w:val="single" w:color="BFBFBF" w:sz="4"/>
+            </w:tcBorders>
+            <w:shd w:fill="F4F6FA" w:color="auto" w:val="clear"/>
+            <w:tcMar>
+              <w:top w:type="dxa" w:w="70"/>
+              <w:left w:type="dxa" w:w="110"/>
+              <w:bottom w:type="dxa" w:w="70"/>
+              <w:right w:type="dxa" w:w="110"/>
+            </w:tcMar>
+          </w:tcPr>
+          <w:p>
+            <w:pPr>
+              <w:spacing w:after="40" w:line="252"/>
+            </w:pPr>
+            <w:r>
+              <w:rPr>
+                <w:b/>
+                <w:bCs/>
+                <w:sz w:val="19"/>
+                <w:szCs w:val="19"/>
+              </w:rPr>
+              <w:t xml:space="preserve">2 · OAuth client-credentials app</w:t>
+            </w:r>
+          </w:p>
+        </w:tc>
+        <w:tc>
+          <w:tcPr>
+            <w:tcW w:type="dxa" w:w="3760"/>
+            <w:tcBorders>
+              <w:top w:val="single" w:color="BFBFBF" w:sz="4"/>
+              <w:left w:val="single" w:color="BFBFBF" w:sz="4"/>
+              <w:bottom w:val="single" w:color="BFBFBF" w:sz="4"/>
+              <w:right w:val="single" w:color="BFBFBF" w:sz="4"/>
+            </w:tcBorders>
+            <w:shd w:fill="F4F6FA" w:color="auto" w:val="clear"/>
+            <w:tcMar>
+              <w:top w:type="dxa" w:w="70"/>
+              <w:left w:type="dxa" w:w="110"/>
+              <w:bottom w:type="dxa" w:w="70"/>
+              <w:right w:type="dxa" w:w="110"/>
+            </w:tcMar>
+          </w:tcPr>
+          <w:p>
+            <w:pPr>
+              <w:spacing w:after="40" w:line="252"/>
+            </w:pPr>
+            <w:r>
+              <w:rPr>
+                <w:b w:val="false"/>
+                <w:bCs w:val="false"/>
+                <w:sz w:val="19"/>
+                <w:szCs w:val="19"/>
+              </w:rPr>
+              <w:t xml:space="preserve">Created in the Machine Identity Console. Its *OAuth application user* is the integration user, so every token acts with that user's read-only roles.</w:t>
+            </w:r>
+          </w:p>
+        </w:tc>
+        <w:tc>
+          <w:tcPr>
+            <w:tcW w:type="dxa" w:w="3386"/>
+            <w:tcBorders>
+              <w:top w:val="single" w:color="BFBFBF" w:sz="4"/>
+              <w:left w:val="single" w:color="BFBFBF" w:sz="4"/>
+              <w:bottom w:val="single" w:color="BFBFBF" w:sz="4"/>
+              <w:right w:val="single" w:color="BFBFBF" w:sz="4"/>
+            </w:tcBorders>
+            <w:shd w:fill="F4F6FA" w:color="auto" w:val="clear"/>
+            <w:tcMar>
+              <w:top w:type="dxa" w:w="70"/>
+              <w:left w:type="dxa" w:w="110"/>
+              <w:bottom w:type="dxa" w:w="70"/>
+              <w:right w:type="dxa" w:w="110"/>
+            </w:tcMar>
+          </w:tcPr>
+          <w:p>
+            <w:pPr>
+              <w:spacing w:after="40" w:line="252"/>
+            </w:pPr>
+            <w:r>
+              <w:rPr>
+                <w:b w:val="false"/>
+                <w:bCs w:val="false"/>
+                <w:sz w:val="19"/>
+                <w:szCs w:val="19"/>
+              </w:rPr>
+              <w:t xml:space="preserve">Client credentials is the standard machine-to-machine flow: no user password is ever sent.</w:t>
+            </w:r>
+          </w:p>
+        </w:tc>
+      </w:tr>
+      <w:tr>
+        <w:tc>
+          <w:tcPr>
+            <w:tcW w:type="dxa" w:w="1880"/>
+            <w:tcBorders>
+              <w:top w:val="single" w:color="BFBFBF" w:sz="4"/>
+              <w:left w:val="single" w:color="BFBFBF" w:sz="4"/>
+              <w:bottom w:val="single" w:color="BFBFBF" w:sz="4"/>
+              <w:right w:val="single" w:color="BFBFBF" w:sz="4"/>
+            </w:tcBorders>
+            <w:tcMar>
+              <w:top w:type="dxa" w:w="70"/>
+              <w:left w:type="dxa" w:w="110"/>
+              <w:bottom w:type="dxa" w:w="70"/>
+              <w:right w:type="dxa" w:w="110"/>
+            </w:tcMar>
+          </w:tcPr>
+          <w:p>
+            <w:pPr>
+              <w:spacing w:after="40" w:line="252"/>
+            </w:pPr>
+            <w:r>
+              <w:rPr>
+                <w:b/>
+                <w:bCs/>
+                <w:sz w:val="19"/>
+                <w:szCs w:val="19"/>
+              </w:rPr>
+              <w:t xml:space="preserve">3 · System property</w:t>
+            </w:r>
+          </w:p>
+        </w:tc>
+        <w:tc>
+          <w:tcPr>
+            <w:tcW w:type="dxa" w:w="3760"/>
+            <w:tcBorders>
+              <w:top w:val="single" w:color="BFBFBF" w:sz="4"/>
+              <w:left w:val="single" w:color="BFBFBF" w:sz="4"/>
+              <w:bottom w:val="single" w:color="BFBFBF" w:sz="4"/>
+              <w:right w:val="single" w:color="BFBFBF" w:sz="4"/>
+            </w:tcBorders>
+            <w:tcMar>
+              <w:top w:type="dxa" w:w="70"/>
+              <w:left w:type="dxa" w:w="110"/>
+              <w:bottom w:type="dxa" w:w="70"/>
+              <w:right w:type="dxa" w:w="110"/>
+            </w:tcMar>
+          </w:tcPr>
+          <w:p>
+            <w:pPr>
+              <w:spacing w:after="40" w:line="252"/>
+            </w:pPr>
+            <w:r>
+              <w:rPr>
+                <w:rFonts w:ascii="Consolas" w:cs="Consolas" w:eastAsia="Consolas" w:hAnsi="Consolas"/>
+                <w:b w:val="false"/>
+                <w:bCs w:val="false"/>
+                <w:color w:val="8B2E2E"/>
+                <w:sz w:val="19"/>
+                <w:szCs w:val="19"/>
+              </w:rPr>
+              <w:t xml:space="preserve">glide.oauth.inbound.client.credential.grant_type.enabled = true</w:t>
+            </w:r>
+            <w:r>
+              <w:rPr>
+                <w:b w:val="false"/>
+                <w:bCs w:val="false"/>
+                <w:sz w:val="19"/>
+                <w:szCs w:val="19"/>
+              </w:rPr>
+              <w:t xml:space="preserve">.</w:t>
+            </w:r>
+          </w:p>
+        </w:tc>
+        <w:tc>
+          <w:tcPr>
+            <w:tcW w:type="dxa" w:w="3386"/>
+            <w:tcBorders>
+              <w:top w:val="single" w:color="BFBFBF" w:sz="4"/>
+              <w:left w:val="single" w:color="BFBFBF" w:sz="4"/>
+              <w:bottom w:val="single" w:color="BFBFBF" w:sz="4"/>
+              <w:right w:val="single" w:color="BFBFBF" w:sz="4"/>
+            </w:tcBorders>
+            <w:tcMar>
+              <w:top w:type="dxa" w:w="70"/>
+              <w:left w:type="dxa" w:w="110"/>
+              <w:bottom w:type="dxa" w:w="70"/>
+              <w:right w:type="dxa" w:w="110"/>
+            </w:tcMar>
+          </w:tcPr>
+          <w:p>
+            <w:pPr>
+              <w:spacing w:after="40" w:line="252"/>
+            </w:pPr>
+            <w:r>
+              <w:rPr>
+                <w:b w:val="false"/>
+                <w:bCs w:val="false"/>
+                <w:sz w:val="19"/>
+                <w:szCs w:val="19"/>
+              </w:rPr>
+              <w:t xml:space="preserve">Without it ServiceNow refuses every client-credentials token request (</w:t>
+            </w:r>
+            <w:r>
+              <w:rPr>
+                <w:rFonts w:ascii="Consolas" w:cs="Consolas" w:eastAsia="Consolas" w:hAnsi="Consolas"/>
+                <w:b w:val="false"/>
+                <w:bCs w:val="false"/>
+                <w:color w:val="8B2E2E"/>
+                <w:sz w:val="19"/>
+                <w:szCs w:val="19"/>
+              </w:rPr>
+              <w:t xml:space="preserve">access_denied</w:t>
+            </w:r>
+            <w:r>
+              <w:rPr>
+                <w:b w:val="false"/>
+                <w:bCs w:val="false"/>
+                <w:sz w:val="19"/>
+                <w:szCs w:val="19"/>
+              </w:rPr>
+              <w:t xml:space="preserve">).</w:t>
+            </w:r>
+          </w:p>
+        </w:tc>
+      </w:tr>
+      <w:tr>
+        <w:tc>
+          <w:tcPr>
+            <w:tcW w:type="dxa" w:w="1880"/>
+            <w:tcBorders>
+              <w:top w:val="single" w:color="BFBFBF" w:sz="4"/>
+              <w:left w:val="single" w:color="BFBFBF" w:sz="4"/>
+              <w:bottom w:val="single" w:color="BFBFBF" w:sz="4"/>
+              <w:right w:val="single" w:color="BFBFBF" w:sz="4"/>
+            </w:tcBorders>
+            <w:shd w:fill="F4F6FA" w:color="auto" w:val="clear"/>
+            <w:tcMar>
+              <w:top w:type="dxa" w:w="70"/>
+              <w:left w:type="dxa" w:w="110"/>
+              <w:bottom w:type="dxa" w:w="70"/>
+              <w:right w:type="dxa" w:w="110"/>
+            </w:tcMar>
+          </w:tcPr>
+          <w:p>
+            <w:pPr>
+              <w:spacing w:after="40" w:line="252"/>
+            </w:pPr>
+            <w:r>
+              <w:rPr>
+                <w:b/>
+                <w:bCs/>
+                <w:sz w:val="19"/>
+                <w:szCs w:val="19"/>
+              </w:rPr>
+              <w:t xml:space="preserve">4 · Token scope</w:t>
+            </w:r>
+          </w:p>
+        </w:tc>
+        <w:tc>
+          <w:tcPr>
+            <w:tcW w:type="dxa" w:w="3760"/>
+            <w:tcBorders>
+              <w:top w:val="single" w:color="BFBFBF" w:sz="4"/>
+              <w:left w:val="single" w:color="BFBFBF" w:sz="4"/>
+              <w:bottom w:val="single" w:color="BFBFBF" w:sz="4"/>
+              <w:right w:val="single" w:color="BFBFBF" w:sz="4"/>
+            </w:tcBorders>
+            <w:shd w:fill="F4F6FA" w:color="auto" w:val="clear"/>
+            <w:tcMar>
+              <w:top w:type="dxa" w:w="70"/>
+              <w:left w:type="dxa" w:w="110"/>
+              <w:bottom w:type="dxa" w:w="70"/>
+              <w:right w:type="dxa" w:w="110"/>
+            </w:tcMar>
+          </w:tcPr>
+          <w:p>
+            <w:pPr>
+              <w:spacing w:after="40" w:line="252"/>
+            </w:pPr>
+            <w:r>
+              <w:rPr>
+                <w:b w:val="false"/>
+                <w:bCs w:val="false"/>
+                <w:sz w:val="19"/>
+                <w:szCs w:val="19"/>
+              </w:rPr>
+              <w:t xml:space="preserve">*Scope Restriction* set to </w:t>
+            </w:r>
+            <w:r>
+              <w:rPr>
+                <w:b w:val="false"/>
+                <w:bCs w:val="false"/>
+                <w:sz w:val="19"/>
+                <w:szCs w:val="19"/>
+              </w:rPr>
+              <w:t xml:space="preserve">Broadly scoped</w:t>
+            </w:r>
+            <w:r>
+              <w:rPr>
+                <w:b w:val="false"/>
+                <w:bCs w:val="false"/>
+                <w:sz w:val="19"/>
+                <w:szCs w:val="19"/>
+              </w:rPr>
+              <w:t xml:space="preserve"> (equivalent: add the </w:t>
+            </w:r>
+            <w:r>
+              <w:rPr>
+                <w:rFonts w:ascii="Consolas" w:cs="Consolas" w:eastAsia="Consolas" w:hAnsi="Consolas"/>
+                <w:b w:val="false"/>
+                <w:bCs w:val="false"/>
+                <w:color w:val="8B2E2E"/>
+                <w:sz w:val="19"/>
+                <w:szCs w:val="19"/>
+              </w:rPr>
+              <w:t xml:space="preserve">useraccount</w:t>
+            </w:r>
+            <w:r>
+              <w:rPr>
+                <w:b w:val="false"/>
+                <w:bCs w:val="false"/>
+                <w:sz w:val="19"/>
+                <w:szCs w:val="19"/>
+              </w:rPr>
+              <w:t xml:space="preserve"> scope).</w:t>
+            </w:r>
+          </w:p>
+        </w:tc>
+        <w:tc>
+          <w:tcPr>
+            <w:tcW w:type="dxa" w:w="3386"/>
+            <w:tcBorders>
+              <w:top w:val="single" w:color="BFBFBF" w:sz="4"/>
+              <w:left w:val="single" w:color="BFBFBF" w:sz="4"/>
+              <w:bottom w:val="single" w:color="BFBFBF" w:sz="4"/>
+              <w:right w:val="single" w:color="BFBFBF" w:sz="4"/>
+            </w:tcBorders>
+            <w:shd w:fill="F4F6FA" w:color="auto" w:val="clear"/>
+            <w:tcMar>
+              <w:top w:type="dxa" w:w="70"/>
+              <w:left w:type="dxa" w:w="110"/>
+              <w:bottom w:type="dxa" w:w="70"/>
+              <w:right w:type="dxa" w:w="110"/>
+            </w:tcMar>
+          </w:tcPr>
+          <w:p>
+            <w:pPr>
+              <w:spacing w:after="40" w:line="252"/>
+            </w:pPr>
+            <w:r>
+              <w:rPr>
+                <w:b w:val="false"/>
+                <w:bCs w:val="false"/>
+                <w:sz w:val="19"/>
+                <w:szCs w:val="19"/>
+              </w:rPr>
+              <w:t xml:space="preserve">A *Securely scoped* token is refused by the Table API ("Access to unscoped api is not allowed"). Broad scope is accepted on a developer instance; a pilot should instead use a REST API access policy limited to the Table API.</w:t>
+            </w:r>
+          </w:p>
+        </w:tc>
+      </w:tr>
+      <w:tr>
+        <w:tc>
+          <w:tcPr>
+            <w:tcW w:type="dxa" w:w="1880"/>
+            <w:tcBorders>
+              <w:top w:val="single" w:color="BFBFBF" w:sz="4"/>
+              <w:left w:val="single" w:color="BFBFBF" w:sz="4"/>
+              <w:bottom w:val="single" w:color="BFBFBF" w:sz="4"/>
+              <w:right w:val="single" w:color="BFBFBF" w:sz="4"/>
+            </w:tcBorders>
+            <w:tcMar>
+              <w:top w:type="dxa" w:w="70"/>
+              <w:left w:type="dxa" w:w="110"/>
+              <w:bottom w:type="dxa" w:w="70"/>
+              <w:right w:type="dxa" w:w="110"/>
+            </w:tcMar>
+          </w:tcPr>
+          <w:p>
+            <w:pPr>
+              <w:spacing w:after="40" w:line="252"/>
+            </w:pPr>
+            <w:r>
+              <w:rPr>
+                <w:b/>
+                <w:bCs/>
+                <w:sz w:val="19"/>
+                <w:szCs w:val="19"/>
+              </w:rPr>
+              <w:t xml:space="preserve">5 · Secrets to OpsIntel</w:t>
+            </w:r>
+          </w:p>
+        </w:tc>
+        <w:tc>
+          <w:tcPr>
+            <w:tcW w:type="dxa" w:w="3760"/>
+            <w:tcBorders>
+              <w:top w:val="single" w:color="BFBFBF" w:sz="4"/>
+              <w:left w:val="single" w:color="BFBFBF" w:sz="4"/>
+              <w:bottom w:val="single" w:color="BFBFBF" w:sz="4"/>
+              <w:right w:val="single" w:color="BFBFBF" w:sz="4"/>
+            </w:tcBorders>
+            <w:tcMar>
+              <w:top w:type="dxa" w:w="70"/>
+              <w:left w:type="dxa" w:w="110"/>
+              <w:bottom w:type="dxa" w:w="70"/>
+              <w:right w:type="dxa" w:w="110"/>
+            </w:tcMar>
+          </w:tcPr>
+          <w:p>
+            <w:pPr>
+              <w:spacing w:after="40" w:line="252"/>
+            </w:pPr>
+            <w:r>
+              <w:rPr>
+                <w:b w:val="false"/>
+                <w:bCs w:val="false"/>
+                <w:sz w:val="19"/>
+                <w:szCs w:val="19"/>
+              </w:rPr>
+              <w:t xml:space="preserve">Client id and secret go into the git-ignored </w:t>
+            </w:r>
+            <w:r>
+              <w:rPr>
+                <w:rFonts w:ascii="Consolas" w:cs="Consolas" w:eastAsia="Consolas" w:hAnsi="Consolas"/>
+                <w:b w:val="false"/>
+                <w:bCs w:val="false"/>
+                <w:color w:val="8B2E2E"/>
+                <w:sz w:val="19"/>
+                <w:szCs w:val="19"/>
+              </w:rPr>
+              <w:t xml:space="preserve">.env</w:t>
+            </w:r>
+            <w:r>
+              <w:rPr>
+                <w:b w:val="false"/>
+                <w:bCs w:val="false"/>
+                <w:sz w:val="19"/>
+                <w:szCs w:val="19"/>
+              </w:rPr>
+              <w:t xml:space="preserve"> (or environment variables).</w:t>
+            </w:r>
+          </w:p>
+        </w:tc>
+        <w:tc>
+          <w:tcPr>
+            <w:tcW w:type="dxa" w:w="3386"/>
+            <w:tcBorders>
+              <w:top w:val="single" w:color="BFBFBF" w:sz="4"/>
+              <w:left w:val="single" w:color="BFBFBF" w:sz="4"/>
+              <w:bottom w:val="single" w:color="BFBFBF" w:sz="4"/>
+              <w:right w:val="single" w:color="BFBFBF" w:sz="4"/>
+            </w:tcBorders>
+            <w:tcMar>
+              <w:top w:type="dxa" w:w="70"/>
+              <w:left w:type="dxa" w:w="110"/>
+              <w:bottom w:type="dxa" w:w="70"/>
+              <w:right w:type="dxa" w:w="110"/>
+            </w:tcMar>
+          </w:tcPr>
+          <w:p>
+            <w:pPr>
+              <w:spacing w:after="40" w:line="252"/>
+            </w:pPr>
+            <w:r>
+              <w:rPr>
+                <w:b w:val="false"/>
+                <w:bCs w:val="false"/>
+                <w:sz w:val="19"/>
+                <w:szCs w:val="19"/>
+              </w:rPr>
+              <w:t xml:space="preserve">Secrets never appear in code, Docker images, logs or chat.</w:t>
+            </w:r>
+          </w:p>
+        </w:tc>
+      </w:tr>
+    </w:tbl>
+    <w:p>
+      <w:pPr>
+        <w:spacing w:after="160"/>
+      </w:pPr>
+    </w:p>
+    <w:p>
+      <w:pPr>
+        <w:pStyle w:val="Heading2"/>
+      </w:pPr>
+      <w:r>
+        <w:t xml:space="preserve">Middle - each run (make sn-test, make sn-sync)</w:t>
+      </w:r>
+    </w:p>
+    <w:tbl>
+      <w:tblPr>
+        <w:tblW w:type="dxa" w:w="9026"/>
+        <w:tblBorders>
+          <w:top w:val="single" w:color="auto" w:sz="4"/>
+          <w:left w:val="single" w:color="auto" w:sz="4"/>
+          <w:bottom w:val="single" w:color="auto" w:sz="4"/>
+          <w:right w:val="single" w:color="auto" w:sz="4"/>
+          <w:insideH w:val="single" w:color="auto" w:sz="4"/>
+          <w:insideV w:val="single" w:color="auto" w:sz="4"/>
+        </w:tblBorders>
+      </w:tblPr>
+      <w:tblGrid>
+        <w:gridCol w:w="1880"/>
+        <w:gridCol w:w="3760"/>
+        <w:gridCol w:w="3386"/>
+      </w:tblGrid>
+      <w:tr>
+        <w:trPr>
+          <w:tblHeader/>
+        </w:trPr>
+        <w:tc>
+          <w:tcPr>
+            <w:tcW w:type="dxa" w:w="1880"/>
+            <w:tcBorders>
+              <w:top w:val="single" w:color="BFBFBF" w:sz="4"/>
+              <w:left w:val="single" w:color="BFBFBF" w:sz="4"/>
+              <w:bottom w:val="single" w:color="BFBFBF" w:sz="4"/>
+              <w:right w:val="single" w:color="BFBFBF" w:sz="4"/>
+            </w:tcBorders>
+            <w:shd w:fill="1F3864" w:color="auto" w:val="clear"/>
+            <w:tcMar>
+              <w:top w:type="dxa" w:w="70"/>
+              <w:left w:type="dxa" w:w="110"/>
+              <w:bottom w:type="dxa" w:w="70"/>
+              <w:right w:type="dxa" w:w="110"/>
+            </w:tcMar>
+          </w:tcPr>
+          <w:p>
+            <w:r>
+              <w:rPr>
+                <w:b/>
+                <w:bCs/>
+                <w:color w:val="FFFFFF"/>
+                <w:sz w:val="19"/>
+                <w:szCs w:val="19"/>
+              </w:rPr>
+              <w:t xml:space="preserve">Block</w:t>
+            </w:r>
+          </w:p>
+        </w:tc>
+        <w:tc>
+          <w:tcPr>
+            <w:tcW w:type="dxa" w:w="3760"/>
+            <w:tcBorders>
+              <w:top w:val="single" w:color="BFBFBF" w:sz="4"/>
+              <w:left w:val="single" w:color="BFBFBF" w:sz="4"/>
+              <w:bottom w:val="single" w:color="BFBFBF" w:sz="4"/>
+              <w:right w:val="single" w:color="BFBFBF" w:sz="4"/>
+            </w:tcBorders>
+            <w:shd w:fill="1F3864" w:color="auto" w:val="clear"/>
+            <w:tcMar>
+              <w:top w:type="dxa" w:w="70"/>
+              <w:left w:type="dxa" w:w="110"/>
+              <w:bottom w:type="dxa" w:w="70"/>
+              <w:right w:type="dxa" w:w="110"/>
+            </w:tcMar>
+          </w:tcPr>
+          <w:p>
+            <w:r>
+              <w:rPr>
+                <w:b/>
+                <w:bCs/>
+                <w:color w:val="FFFFFF"/>
+                <w:sz w:val="19"/>
+                <w:szCs w:val="19"/>
+              </w:rPr>
+              <w:t xml:space="preserve">What it is / what it does</w:t>
+            </w:r>
+          </w:p>
+        </w:tc>
+        <w:tc>
+          <w:tcPr>
+            <w:tcW w:type="dxa" w:w="3386"/>
+            <w:tcBorders>
+              <w:top w:val="single" w:color="BFBFBF" w:sz="4"/>
+              <w:left w:val="single" w:color="BFBFBF" w:sz="4"/>
+              <w:bottom w:val="single" w:color="BFBFBF" w:sz="4"/>
+              <w:right w:val="single" w:color="BFBFBF" w:sz="4"/>
+            </w:tcBorders>
+            <w:shd w:fill="1F3864" w:color="auto" w:val="clear"/>
+            <w:tcMar>
+              <w:top w:type="dxa" w:w="70"/>
+              <w:left w:type="dxa" w:w="110"/>
+              <w:bottom w:type="dxa" w:w="70"/>
+              <w:right w:type="dxa" w:w="110"/>
+            </w:tcMar>
+          </w:tcPr>
+          <w:p>
+            <w:r>
+              <w:rPr>
+                <w:b/>
+                <w:bCs/>
+                <w:color w:val="FFFFFF"/>
+                <w:sz w:val="19"/>
+                <w:szCs w:val="19"/>
+              </w:rPr>
+              <w:t xml:space="preserve">Design rationale &amp; where in the code</w:t>
+            </w:r>
+          </w:p>
+        </w:tc>
+      </w:tr>
+      <w:tr>
+        <w:tc>
+          <w:tcPr>
+            <w:tcW w:type="dxa" w:w="1880"/>
+            <w:tcBorders>
+              <w:top w:val="single" w:color="BFBFBF" w:sz="4"/>
+              <w:left w:val="single" w:color="BFBFBF" w:sz="4"/>
+              <w:bottom w:val="single" w:color="BFBFBF" w:sz="4"/>
+              <w:right w:val="single" w:color="BFBFBF" w:sz="4"/>
+            </w:tcBorders>
+            <w:tcMar>
+              <w:top w:type="dxa" w:w="70"/>
+              <w:left w:type="dxa" w:w="110"/>
+              <w:bottom w:type="dxa" w:w="70"/>
+              <w:right w:type="dxa" w:w="110"/>
+            </w:tcMar>
+          </w:tcPr>
+          <w:p>
+            <w:pPr>
+              <w:spacing w:after="40" w:line="252"/>
+            </w:pPr>
+            <w:r>
+              <w:rPr>
+                <w:b/>
+                <w:bCs/>
+                <w:sz w:val="19"/>
+                <w:szCs w:val="19"/>
+              </w:rPr>
+              <w:t xml:space="preserve">.env / environment</w:t>
+            </w:r>
+          </w:p>
+        </w:tc>
+        <w:tc>
+          <w:tcPr>
+            <w:tcW w:type="dxa" w:w="3760"/>
+            <w:tcBorders>
+              <w:top w:val="single" w:color="BFBFBF" w:sz="4"/>
+              <w:left w:val="single" w:color="BFBFBF" w:sz="4"/>
+              <w:bottom w:val="single" w:color="BFBFBF" w:sz="4"/>
+              <w:right w:val="single" w:color="BFBFBF" w:sz="4"/>
+            </w:tcBorders>
+            <w:tcMar>
+              <w:top w:type="dxa" w:w="70"/>
+              <w:left w:type="dxa" w:w="110"/>
+              <w:bottom w:type="dxa" w:w="70"/>
+              <w:right w:type="dxa" w:w="110"/>
+            </w:tcMar>
+          </w:tcPr>
+          <w:p>
+            <w:pPr>
+              <w:spacing w:after="40" w:line="252"/>
+            </w:pPr>
+            <w:r>
+              <w:rPr>
+                <w:rFonts w:ascii="Consolas" w:cs="Consolas" w:eastAsia="Consolas" w:hAnsi="Consolas"/>
+                <w:b w:val="false"/>
+                <w:bCs w:val="false"/>
+                <w:color w:val="8B2E2E"/>
+                <w:sz w:val="19"/>
+                <w:szCs w:val="19"/>
+              </w:rPr>
+              <w:t xml:space="preserve">SN_INSTANCE</w:t>
+            </w:r>
+            <w:r>
+              <w:rPr>
+                <w:b w:val="false"/>
+                <w:bCs w:val="false"/>
+                <w:sz w:val="19"/>
+                <w:szCs w:val="19"/>
+              </w:rPr>
+              <w:t xml:space="preserve">, </w:t>
+            </w:r>
+            <w:r>
+              <w:rPr>
+                <w:rFonts w:ascii="Consolas" w:cs="Consolas" w:eastAsia="Consolas" w:hAnsi="Consolas"/>
+                <w:b w:val="false"/>
+                <w:bCs w:val="false"/>
+                <w:color w:val="8B2E2E"/>
+                <w:sz w:val="19"/>
+                <w:szCs w:val="19"/>
+              </w:rPr>
+              <w:t xml:space="preserve">SN_CLIENT_ID</w:t>
+            </w:r>
+            <w:r>
+              <w:rPr>
+                <w:b w:val="false"/>
+                <w:bCs w:val="false"/>
+                <w:sz w:val="19"/>
+                <w:szCs w:val="19"/>
+              </w:rPr>
+              <w:t xml:space="preserve">, </w:t>
+            </w:r>
+            <w:r>
+              <w:rPr>
+                <w:rFonts w:ascii="Consolas" w:cs="Consolas" w:eastAsia="Consolas" w:hAnsi="Consolas"/>
+                <w:b w:val="false"/>
+                <w:bCs w:val="false"/>
+                <w:color w:val="8B2E2E"/>
+                <w:sz w:val="19"/>
+                <w:szCs w:val="19"/>
+              </w:rPr>
+              <w:t xml:space="preserve">SN_CLIENT_SECRET</w:t>
+            </w:r>
+            <w:r>
+              <w:rPr>
+                <w:b w:val="false"/>
+                <w:bCs w:val="false"/>
+                <w:sz w:val="19"/>
+                <w:szCs w:val="19"/>
+              </w:rPr>
+              <w:t xml:space="preserve"> (or </w:t>
+            </w:r>
+            <w:r>
+              <w:rPr>
+                <w:rFonts w:ascii="Consolas" w:cs="Consolas" w:eastAsia="Consolas" w:hAnsi="Consolas"/>
+                <w:b w:val="false"/>
+                <w:bCs w:val="false"/>
+                <w:color w:val="8B2E2E"/>
+                <w:sz w:val="19"/>
+                <w:szCs w:val="19"/>
+              </w:rPr>
+              <w:t xml:space="preserve">SN_USERNAME</w:t>
+            </w:r>
+            <w:r>
+              <w:rPr>
+                <w:b w:val="false"/>
+                <w:bCs w:val="false"/>
+                <w:sz w:val="19"/>
+                <w:szCs w:val="19"/>
+              </w:rPr>
+              <w:t xml:space="preserve"> / </w:t>
+            </w:r>
+            <w:r>
+              <w:rPr>
+                <w:rFonts w:ascii="Consolas" w:cs="Consolas" w:eastAsia="Consolas" w:hAnsi="Consolas"/>
+                <w:b w:val="false"/>
+                <w:bCs w:val="false"/>
+                <w:color w:val="8B2E2E"/>
+                <w:sz w:val="19"/>
+                <w:szCs w:val="19"/>
+              </w:rPr>
+              <w:t xml:space="preserve">SN_PASSWORD</w:t>
+            </w:r>
+            <w:r>
+              <w:rPr>
+                <w:b w:val="false"/>
+                <w:bCs w:val="false"/>
+                <w:sz w:val="19"/>
+                <w:szCs w:val="19"/>
+              </w:rPr>
+              <w:t xml:space="preserve"> for basic auth).</w:t>
+            </w:r>
+          </w:p>
+        </w:tc>
+        <w:tc>
+          <w:tcPr>
+            <w:tcW w:type="dxa" w:w="3386"/>
+            <w:tcBorders>
+              <w:top w:val="single" w:color="BFBFBF" w:sz="4"/>
+              <w:left w:val="single" w:color="BFBFBF" w:sz="4"/>
+              <w:bottom w:val="single" w:color="BFBFBF" w:sz="4"/>
+              <w:right w:val="single" w:color="BFBFBF" w:sz="4"/>
+            </w:tcBorders>
+            <w:tcMar>
+              <w:top w:type="dxa" w:w="70"/>
+              <w:left w:type="dxa" w:w="110"/>
+              <w:bottom w:type="dxa" w:w="70"/>
+              <w:right w:type="dxa" w:w="110"/>
+            </w:tcMar>
+          </w:tcPr>
+          <w:p>
+            <w:pPr>
+              <w:spacing w:after="40" w:line="252"/>
+            </w:pPr>
+            <w:r>
+              <w:rPr>
+                <w:b w:val="false"/>
+                <w:bCs w:val="false"/>
+                <w:sz w:val="19"/>
+                <w:szCs w:val="19"/>
+              </w:rPr>
+              <w:t xml:space="preserve">OAuth is chosen automatically when a client id is present.</w:t>
+            </w:r>
+          </w:p>
+        </w:tc>
+      </w:tr>
+      <w:tr>
+        <w:tc>
+          <w:tcPr>
+            <w:tcW w:type="dxa" w:w="1880"/>
+            <w:tcBorders>
+              <w:top w:val="single" w:color="BFBFBF" w:sz="4"/>
+              <w:left w:val="single" w:color="BFBFBF" w:sz="4"/>
+              <w:bottom w:val="single" w:color="BFBFBF" w:sz="4"/>
+              <w:right w:val="single" w:color="BFBFBF" w:sz="4"/>
+            </w:tcBorders>
+            <w:shd w:fill="F4F6FA" w:color="auto" w:val="clear"/>
+            <w:tcMar>
+              <w:top w:type="dxa" w:w="70"/>
+              <w:left w:type="dxa" w:w="110"/>
+              <w:bottom w:type="dxa" w:w="70"/>
+              <w:right w:type="dxa" w:w="110"/>
+            </w:tcMar>
+          </w:tcPr>
+          <w:p>
+            <w:pPr>
+              <w:spacing w:after="40" w:line="252"/>
+            </w:pPr>
+            <w:r>
+              <w:rPr>
+                <w:b/>
+                <w:bCs/>
+                <w:sz w:val="19"/>
+                <w:szCs w:val="19"/>
+              </w:rPr>
+              <w:t xml:space="preserve">POST /oauth_token.do</w:t>
+            </w:r>
+          </w:p>
+        </w:tc>
+        <w:tc>
+          <w:tcPr>
+            <w:tcW w:type="dxa" w:w="3760"/>
+            <w:tcBorders>
+              <w:top w:val="single" w:color="BFBFBF" w:sz="4"/>
+              <w:left w:val="single" w:color="BFBFBF" w:sz="4"/>
+              <w:bottom w:val="single" w:color="BFBFBF" w:sz="4"/>
+              <w:right w:val="single" w:color="BFBFBF" w:sz="4"/>
+            </w:tcBorders>
+            <w:shd w:fill="F4F6FA" w:color="auto" w:val="clear"/>
+            <w:tcMar>
+              <w:top w:type="dxa" w:w="70"/>
+              <w:left w:type="dxa" w:w="110"/>
+              <w:bottom w:type="dxa" w:w="70"/>
+              <w:right w:type="dxa" w:w="110"/>
+            </w:tcMar>
+          </w:tcPr>
+          <w:p>
+            <w:pPr>
+              <w:spacing w:after="40" w:line="252"/>
+            </w:pPr>
+            <w:r>
+              <w:rPr>
+                <w:b w:val="false"/>
+                <w:bCs w:val="false"/>
+                <w:sz w:val="19"/>
+                <w:szCs w:val="19"/>
+              </w:rPr>
+              <w:t xml:space="preserve">Exchanges the client id and secret for a bearer token; refreshed before it expires.</w:t>
+            </w:r>
+          </w:p>
+        </w:tc>
+        <w:tc>
+          <w:tcPr>
+            <w:tcW w:type="dxa" w:w="3386"/>
+            <w:tcBorders>
+              <w:top w:val="single" w:color="BFBFBF" w:sz="4"/>
+              <w:left w:val="single" w:color="BFBFBF" w:sz="4"/>
+              <w:bottom w:val="single" w:color="BFBFBF" w:sz="4"/>
+              <w:right w:val="single" w:color="BFBFBF" w:sz="4"/>
+            </w:tcBorders>
+            <w:shd w:fill="F4F6FA" w:color="auto" w:val="clear"/>
+            <w:tcMar>
+              <w:top w:type="dxa" w:w="70"/>
+              <w:left w:type="dxa" w:w="110"/>
+              <w:bottom w:type="dxa" w:w="70"/>
+              <w:right w:type="dxa" w:w="110"/>
+            </w:tcMar>
+          </w:tcPr>
+          <w:p>
+            <w:pPr>
+              <w:spacing w:after="40" w:line="252"/>
+            </w:pPr>
+            <w:r>
+              <w:rPr>
+                <w:b w:val="false"/>
+                <w:bCs w:val="false"/>
+                <w:sz w:val="19"/>
+                <w:szCs w:val="19"/>
+              </w:rPr>
+              <w:t xml:space="preserve">The only POST the connector ever makes.</w:t>
+            </w:r>
+          </w:p>
+        </w:tc>
+      </w:tr>
+      <w:tr>
+        <w:tc>
+          <w:tcPr>
+            <w:tcW w:type="dxa" w:w="1880"/>
+            <w:tcBorders>
+              <w:top w:val="single" w:color="BFBFBF" w:sz="4"/>
+              <w:left w:val="single" w:color="BFBFBF" w:sz="4"/>
+              <w:bottom w:val="single" w:color="BFBFBF" w:sz="4"/>
+              <w:right w:val="single" w:color="BFBFBF" w:sz="4"/>
+            </w:tcBorders>
+            <w:tcMar>
+              <w:top w:type="dxa" w:w="70"/>
+              <w:left w:type="dxa" w:w="110"/>
+              <w:bottom w:type="dxa" w:w="70"/>
+              <w:right w:type="dxa" w:w="110"/>
+            </w:tcMar>
+          </w:tcPr>
+          <w:p>
+            <w:pPr>
+              <w:spacing w:after="40" w:line="252"/>
+            </w:pPr>
+            <w:r>
+              <w:rPr>
+                <w:b/>
+                <w:bCs/>
+                <w:sz w:val="19"/>
+                <w:szCs w:val="19"/>
+              </w:rPr>
+              <w:t xml:space="preserve">GET /api/now/table/…</w:t>
+            </w:r>
+          </w:p>
+        </w:tc>
+        <w:tc>
+          <w:tcPr>
+            <w:tcW w:type="dxa" w:w="3760"/>
+            <w:tcBorders>
+              <w:top w:val="single" w:color="BFBFBF" w:sz="4"/>
+              <w:left w:val="single" w:color="BFBFBF" w:sz="4"/>
+              <w:bottom w:val="single" w:color="BFBFBF" w:sz="4"/>
+              <w:right w:val="single" w:color="BFBFBF" w:sz="4"/>
+            </w:tcBorders>
+            <w:tcMar>
+              <w:top w:type="dxa" w:w="70"/>
+              <w:left w:type="dxa" w:w="110"/>
+              <w:bottom w:type="dxa" w:w="70"/>
+              <w:right w:type="dxa" w:w="110"/>
+            </w:tcMar>
+          </w:tcPr>
+          <w:p>
+            <w:pPr>
+              <w:spacing w:after="40" w:line="252"/>
+            </w:pPr>
+            <w:r>
+              <w:rPr>
+                <w:b w:val="false"/>
+                <w:bCs w:val="false"/>
+                <w:sz w:val="19"/>
+                <w:szCs w:val="19"/>
+              </w:rPr>
+              <w:t xml:space="preserve">Reads incidents, requested items, business services, companies, business units, and only the configuration items that incidents reference - 1,000 rows per page with values and display values.</w:t>
+            </w:r>
+          </w:p>
+        </w:tc>
+        <w:tc>
+          <w:tcPr>
+            <w:tcW w:type="dxa" w:w="3386"/>
+            <w:tcBorders>
+              <w:top w:val="single" w:color="BFBFBF" w:sz="4"/>
+              <w:left w:val="single" w:color="BFBFBF" w:sz="4"/>
+              <w:bottom w:val="single" w:color="BFBFBF" w:sz="4"/>
+              <w:right w:val="single" w:color="BFBFBF" w:sz="4"/>
+            </w:tcBorders>
+            <w:tcMar>
+              <w:top w:type="dxa" w:w="70"/>
+              <w:left w:type="dxa" w:w="110"/>
+              <w:bottom w:type="dxa" w:w="70"/>
+              <w:right w:type="dxa" w:w="110"/>
+            </w:tcMar>
+          </w:tcPr>
+          <w:p>
+            <w:pPr>
+              <w:spacing w:after="40" w:line="252"/>
+            </w:pPr>
+            <w:r>
+              <w:rPr>
+                <w:b w:val="false"/>
+                <w:bCs w:val="false"/>
+                <w:sz w:val="19"/>
+                <w:szCs w:val="19"/>
+              </w:rPr>
+              <w:t xml:space="preserve">GET-only: the connector cannot change the instance. Paging keeps memory flat; retries handle rate limits.</w:t>
+            </w:r>
+          </w:p>
+        </w:tc>
+      </w:tr>
+      <w:tr>
+        <w:tc>
+          <w:tcPr>
+            <w:tcW w:type="dxa" w:w="1880"/>
+            <w:tcBorders>
+              <w:top w:val="single" w:color="BFBFBF" w:sz="4"/>
+              <w:left w:val="single" w:color="BFBFBF" w:sz="4"/>
+              <w:bottom w:val="single" w:color="BFBFBF" w:sz="4"/>
+              <w:right w:val="single" w:color="BFBFBF" w:sz="4"/>
+            </w:tcBorders>
+            <w:shd w:fill="F4F6FA" w:color="auto" w:val="clear"/>
+            <w:tcMar>
+              <w:top w:type="dxa" w:w="70"/>
+              <w:left w:type="dxa" w:w="110"/>
+              <w:bottom w:type="dxa" w:w="70"/>
+              <w:right w:type="dxa" w:w="110"/>
+            </w:tcMar>
+          </w:tcPr>
+          <w:p>
+            <w:pPr>
+              <w:spacing w:after="40" w:line="252"/>
+            </w:pPr>
+            <w:r>
+              <w:rPr>
+                <w:b/>
+                <w:bCs/>
+                <w:sz w:val="19"/>
+                <w:szCs w:val="19"/>
+              </w:rPr>
+              <w:t xml:space="preserve">Decision: 401?</w:t>
+            </w:r>
+          </w:p>
+        </w:tc>
+        <w:tc>
+          <w:tcPr>
+            <w:tcW w:type="dxa" w:w="3760"/>
+            <w:tcBorders>
+              <w:top w:val="single" w:color="BFBFBF" w:sz="4"/>
+              <w:left w:val="single" w:color="BFBFBF" w:sz="4"/>
+              <w:bottom w:val="single" w:color="BFBFBF" w:sz="4"/>
+              <w:right w:val="single" w:color="BFBFBF" w:sz="4"/>
+            </w:tcBorders>
+            <w:shd w:fill="F4F6FA" w:color="auto" w:val="clear"/>
+            <w:tcMar>
+              <w:top w:type="dxa" w:w="70"/>
+              <w:left w:type="dxa" w:w="110"/>
+              <w:bottom w:type="dxa" w:w="70"/>
+              <w:right w:type="dxa" w:w="110"/>
+            </w:tcMar>
+          </w:tcPr>
+          <w:p>
+            <w:pPr>
+              <w:spacing w:after="40" w:line="252"/>
+            </w:pPr>
+            <w:r>
+              <w:rPr>
+                <w:b w:val="false"/>
+                <w:bCs w:val="false"/>
+                <w:sz w:val="19"/>
+                <w:szCs w:val="19"/>
+              </w:rPr>
+              <w:t xml:space="preserve">If authentication fails, the access check stops after the first failure.</w:t>
+            </w:r>
+          </w:p>
+        </w:tc>
+        <w:tc>
+          <w:tcPr>
+            <w:tcW w:type="dxa" w:w="3386"/>
+            <w:tcBorders>
+              <w:top w:val="single" w:color="BFBFBF" w:sz="4"/>
+              <w:left w:val="single" w:color="BFBFBF" w:sz="4"/>
+              <w:bottom w:val="single" w:color="BFBFBF" w:sz="4"/>
+              <w:right w:val="single" w:color="BFBFBF" w:sz="4"/>
+            </w:tcBorders>
+            <w:shd w:fill="F4F6FA" w:color="auto" w:val="clear"/>
+            <w:tcMar>
+              <w:top w:type="dxa" w:w="70"/>
+              <w:left w:type="dxa" w:w="110"/>
+              <w:bottom w:type="dxa" w:w="70"/>
+              <w:right w:type="dxa" w:w="110"/>
+            </w:tcMar>
+          </w:tcPr>
+          <w:p>
+            <w:pPr>
+              <w:spacing w:after="40" w:line="252"/>
+            </w:pPr>
+            <w:r>
+              <w:rPr>
+                <w:b w:val="false"/>
+                <w:bCs w:val="false"/>
+                <w:sz w:val="19"/>
+                <w:szCs w:val="19"/>
+              </w:rPr>
+              <w:t xml:space="preserve">Repeated failed logins lock ServiceNow accounts - learnt during setup.</w:t>
+            </w:r>
+          </w:p>
+        </w:tc>
+      </w:tr>
+      <w:tr>
+        <w:tc>
+          <w:tcPr>
+            <w:tcW w:type="dxa" w:w="1880"/>
+            <w:tcBorders>
+              <w:top w:val="single" w:color="BFBFBF" w:sz="4"/>
+              <w:left w:val="single" w:color="BFBFBF" w:sz="4"/>
+              <w:bottom w:val="single" w:color="BFBFBF" w:sz="4"/>
+              <w:right w:val="single" w:color="BFBFBF" w:sz="4"/>
+            </w:tcBorders>
+            <w:tcMar>
+              <w:top w:type="dxa" w:w="70"/>
+              <w:left w:type="dxa" w:w="110"/>
+              <w:bottom w:type="dxa" w:w="70"/>
+              <w:right w:type="dxa" w:w="110"/>
+            </w:tcMar>
+          </w:tcPr>
+          <w:p>
+            <w:pPr>
+              <w:spacing w:after="40" w:line="252"/>
+            </w:pPr>
+            <w:r>
+              <w:rPr>
+                <w:b/>
+                <w:bCs/>
+                <w:sz w:val="19"/>
+                <w:szCs w:val="19"/>
+              </w:rPr>
+              <w:t xml:space="preserve">Land (raw format)</w:t>
+            </w:r>
+          </w:p>
+        </w:tc>
+        <w:tc>
+          <w:tcPr>
+            <w:tcW w:type="dxa" w:w="3760"/>
+            <w:tcBorders>
+              <w:top w:val="single" w:color="BFBFBF" w:sz="4"/>
+              <w:left w:val="single" w:color="BFBFBF" w:sz="4"/>
+              <w:bottom w:val="single" w:color="BFBFBF" w:sz="4"/>
+              <w:right w:val="single" w:color="BFBFBF" w:sz="4"/>
+            </w:tcBorders>
+            <w:tcMar>
+              <w:top w:type="dxa" w:w="70"/>
+              <w:left w:type="dxa" w:w="110"/>
+              <w:bottom w:type="dxa" w:w="70"/>
+              <w:right w:type="dxa" w:w="110"/>
+            </w:tcMar>
+          </w:tcPr>
+          <w:p>
+            <w:pPr>
+              <w:spacing w:after="40" w:line="252"/>
+            </w:pPr>
+            <w:r>
+              <w:rPr>
+                <w:b w:val="false"/>
+                <w:bCs w:val="false"/>
+                <w:sz w:val="19"/>
+                <w:szCs w:val="19"/>
+              </w:rPr>
+              <w:t xml:space="preserve">Writes </w:t>
+            </w:r>
+            <w:r>
+              <w:rPr>
+                <w:rFonts w:ascii="Consolas" w:cs="Consolas" w:eastAsia="Consolas" w:hAnsi="Consolas"/>
+                <w:b w:val="false"/>
+                <w:bCs w:val="false"/>
+                <w:color w:val="8B2E2E"/>
+                <w:sz w:val="19"/>
+                <w:szCs w:val="19"/>
+              </w:rPr>
+              <w:t xml:space="preserve">cmdb.sqlite</w:t>
+            </w:r>
+            <w:r>
+              <w:rPr>
+                <w:b w:val="false"/>
+                <w:bCs w:val="false"/>
+                <w:sz w:val="19"/>
+                <w:szCs w:val="19"/>
+              </w:rPr>
+              <w:t xml:space="preserve">, </w:t>
+            </w:r>
+            <w:r>
+              <w:rPr>
+                <w:rFonts w:ascii="Consolas" w:cs="Consolas" w:eastAsia="Consolas" w:hAnsi="Consolas"/>
+                <w:b w:val="false"/>
+                <w:bCs w:val="false"/>
+                <w:color w:val="8B2E2E"/>
+                <w:sz w:val="19"/>
+                <w:szCs w:val="19"/>
+              </w:rPr>
+              <w:t xml:space="preserve">itsm_incidents.csv</w:t>
+            </w:r>
+            <w:r>
+              <w:rPr>
+                <w:b w:val="false"/>
+                <w:bCs w:val="false"/>
+                <w:sz w:val="19"/>
+                <w:szCs w:val="19"/>
+              </w:rPr>
+              <w:t xml:space="preserve">, </w:t>
+            </w:r>
+            <w:r>
+              <w:rPr>
+                <w:rFonts w:ascii="Consolas" w:cs="Consolas" w:eastAsia="Consolas" w:hAnsi="Consolas"/>
+                <w:b w:val="false"/>
+                <w:bCs w:val="false"/>
+                <w:color w:val="8B2E2E"/>
+                <w:sz w:val="19"/>
+                <w:szCs w:val="19"/>
+              </w:rPr>
+              <w:t xml:space="preserve">itsm_requests.csv</w:t>
+            </w:r>
+            <w:r>
+              <w:rPr>
+                <w:b w:val="false"/>
+                <w:bCs w:val="false"/>
+                <w:sz w:val="19"/>
+                <w:szCs w:val="19"/>
+              </w:rPr>
+              <w:t xml:space="preserve"> and </w:t>
+            </w:r>
+            <w:r>
+              <w:rPr>
+                <w:rFonts w:ascii="Consolas" w:cs="Consolas" w:eastAsia="Consolas" w:hAnsi="Consolas"/>
+                <w:b w:val="false"/>
+                <w:bCs w:val="false"/>
+                <w:color w:val="8B2E2E"/>
+                <w:sz w:val="19"/>
+                <w:szCs w:val="19"/>
+              </w:rPr>
+              <w:t xml:space="preserve">source_manifest.json</w:t>
+            </w:r>
+            <w:r>
+              <w:rPr>
+                <w:b w:val="false"/>
+                <w:bCs w:val="false"/>
+                <w:sz w:val="19"/>
+                <w:szCs w:val="19"/>
+              </w:rPr>
+              <w:t xml:space="preserve"> in </w:t>
+            </w:r>
+            <w:r>
+              <w:rPr>
+                <w:rFonts w:ascii="Consolas" w:cs="Consolas" w:eastAsia="Consolas" w:hAnsi="Consolas"/>
+                <w:b w:val="false"/>
+                <w:bCs w:val="false"/>
+                <w:color w:val="8B2E2E"/>
+                <w:sz w:val="19"/>
+                <w:szCs w:val="19"/>
+              </w:rPr>
+              <w:t xml:space="preserve">data_servicenow/raw</w:t>
+            </w:r>
+            <w:r>
+              <w:rPr>
+                <w:b w:val="false"/>
+                <w:bCs w:val="false"/>
+                <w:sz w:val="19"/>
+                <w:szCs w:val="19"/>
+              </w:rPr>
+              <w:t xml:space="preserve">.</w:t>
+            </w:r>
+          </w:p>
+        </w:tc>
+        <w:tc>
+          <w:tcPr>
+            <w:tcW w:type="dxa" w:w="3386"/>
+            <w:tcBorders>
+              <w:top w:val="single" w:color="BFBFBF" w:sz="4"/>
+              <w:left w:val="single" w:color="BFBFBF" w:sz="4"/>
+              <w:bottom w:val="single" w:color="BFBFBF" w:sz="4"/>
+              <w:right w:val="single" w:color="BFBFBF" w:sz="4"/>
+            </w:tcBorders>
+            <w:tcMar>
+              <w:top w:type="dxa" w:w="70"/>
+              <w:left w:type="dxa" w:w="110"/>
+              <w:bottom w:type="dxa" w:w="70"/>
+              <w:right w:type="dxa" w:w="110"/>
+            </w:tcMar>
+          </w:tcPr>
+          <w:p>
+            <w:pPr>
+              <w:spacing w:after="40" w:line="252"/>
+            </w:pPr>
+            <w:r>
+              <w:rPr>
+                <w:b w:val="false"/>
+                <w:bCs w:val="false"/>
+                <w:sz w:val="19"/>
+                <w:szCs w:val="19"/>
+              </w:rPr>
+              <w:t xml:space="preserve">Same shapes as the synthetic sources, so no second pipeline is needed.</w:t>
+            </w:r>
+          </w:p>
+        </w:tc>
+      </w:tr>
+      <w:tr>
+        <w:tc>
+          <w:tcPr>
+            <w:tcW w:type="dxa" w:w="1880"/>
+            <w:tcBorders>
+              <w:top w:val="single" w:color="BFBFBF" w:sz="4"/>
+              <w:left w:val="single" w:color="BFBFBF" w:sz="4"/>
+              <w:bottom w:val="single" w:color="BFBFBF" w:sz="4"/>
+              <w:right w:val="single" w:color="BFBFBF" w:sz="4"/>
+            </w:tcBorders>
+            <w:shd w:fill="F4F6FA" w:color="auto" w:val="clear"/>
+            <w:tcMar>
+              <w:top w:type="dxa" w:w="70"/>
+              <w:left w:type="dxa" w:w="110"/>
+              <w:bottom w:type="dxa" w:w="70"/>
+              <w:right w:type="dxa" w:w="110"/>
+            </w:tcMar>
+          </w:tcPr>
+          <w:p>
+            <w:pPr>
+              <w:spacing w:after="40" w:line="252"/>
+            </w:pPr>
+            <w:r>
+              <w:rPr>
+                <w:b/>
+                <w:bCs/>
+                <w:sz w:val="19"/>
+                <w:szCs w:val="19"/>
+              </w:rPr>
+              <w:t xml:space="preserve">Mapping gaps recorded</w:t>
+            </w:r>
+          </w:p>
+        </w:tc>
+        <w:tc>
+          <w:tcPr>
+            <w:tcW w:type="dxa" w:w="3760"/>
+            <w:tcBorders>
+              <w:top w:val="single" w:color="BFBFBF" w:sz="4"/>
+              <w:left w:val="single" w:color="BFBFBF" w:sz="4"/>
+              <w:bottom w:val="single" w:color="BFBFBF" w:sz="4"/>
+              <w:right w:val="single" w:color="BFBFBF" w:sz="4"/>
+            </w:tcBorders>
+            <w:shd w:fill="F4F6FA" w:color="auto" w:val="clear"/>
+            <w:tcMar>
+              <w:top w:type="dxa" w:w="70"/>
+              <w:left w:type="dxa" w:w="110"/>
+              <w:bottom w:type="dxa" w:w="70"/>
+              <w:right w:type="dxa" w:w="110"/>
+            </w:tcMar>
+          </w:tcPr>
+          <w:p>
+            <w:pPr>
+              <w:spacing w:after="40" w:line="252"/>
+            </w:pPr>
+            <w:r>
+              <w:rPr>
+                <w:b w:val="false"/>
+                <w:bCs w:val="false"/>
+                <w:sz w:val="19"/>
+                <w:szCs w:val="19"/>
+              </w:rPr>
+              <w:t xml:space="preserve">Incidents without a business service or company, requests without a due date, and the absence of costs, alerts and outage minutes are counted in the manifest.</w:t>
+            </w:r>
+          </w:p>
+        </w:tc>
+        <w:tc>
+          <w:tcPr>
+            <w:tcW w:type="dxa" w:w="3386"/>
+            <w:tcBorders>
+              <w:top w:val="single" w:color="BFBFBF" w:sz="4"/>
+              <w:left w:val="single" w:color="BFBFBF" w:sz="4"/>
+              <w:bottom w:val="single" w:color="BFBFBF" w:sz="4"/>
+              <w:right w:val="single" w:color="BFBFBF" w:sz="4"/>
+            </w:tcBorders>
+            <w:shd w:fill="F4F6FA" w:color="auto" w:val="clear"/>
+            <w:tcMar>
+              <w:top w:type="dxa" w:w="70"/>
+              <w:left w:type="dxa" w:w="110"/>
+              <w:bottom w:type="dxa" w:w="70"/>
+              <w:right w:type="dxa" w:w="110"/>
+            </w:tcMar>
+          </w:tcPr>
+          <w:p>
+            <w:pPr>
+              <w:spacing w:after="40" w:line="252"/>
+            </w:pPr>
+            <w:r>
+              <w:rPr>
+                <w:b w:val="false"/>
+                <w:bCs w:val="false"/>
+                <w:sz w:val="19"/>
+                <w:szCs w:val="19"/>
+              </w:rPr>
+              <w:t xml:space="preserve">Gaps are made visible instead of filled with invented values.</w:t>
+            </w:r>
+          </w:p>
+        </w:tc>
+      </w:tr>
+      <w:tr>
+        <w:tc>
+          <w:tcPr>
+            <w:tcW w:type="dxa" w:w="1880"/>
+            <w:tcBorders>
+              <w:top w:val="single" w:color="BFBFBF" w:sz="4"/>
+              <w:left w:val="single" w:color="BFBFBF" w:sz="4"/>
+              <w:bottom w:val="single" w:color="BFBFBF" w:sz="4"/>
+              <w:right w:val="single" w:color="BFBFBF" w:sz="4"/>
+            </w:tcBorders>
+            <w:tcMar>
+              <w:top w:type="dxa" w:w="70"/>
+              <w:left w:type="dxa" w:w="110"/>
+              <w:bottom w:type="dxa" w:w="70"/>
+              <w:right w:type="dxa" w:w="110"/>
+            </w:tcMar>
+          </w:tcPr>
+          <w:p>
+            <w:pPr>
+              <w:spacing w:after="40" w:line="252"/>
+            </w:pPr>
+            <w:r>
+              <w:rPr>
+                <w:b/>
+                <w:bCs/>
+                <w:sz w:val="19"/>
+                <w:szCs w:val="19"/>
+              </w:rPr>
+              <w:t xml:space="preserve">Same ETL pipeline</w:t>
+            </w:r>
+          </w:p>
+        </w:tc>
+        <w:tc>
+          <w:tcPr>
+            <w:tcW w:type="dxa" w:w="3760"/>
+            <w:tcBorders>
+              <w:top w:val="single" w:color="BFBFBF" w:sz="4"/>
+              <w:left w:val="single" w:color="BFBFBF" w:sz="4"/>
+              <w:bottom w:val="single" w:color="BFBFBF" w:sz="4"/>
+              <w:right w:val="single" w:color="BFBFBF" w:sz="4"/>
+            </w:tcBorders>
+            <w:tcMar>
+              <w:top w:type="dxa" w:w="70"/>
+              <w:left w:type="dxa" w:w="110"/>
+              <w:bottom w:type="dxa" w:w="70"/>
+              <w:right w:type="dxa" w:w="110"/>
+            </w:tcMar>
+          </w:tcPr>
+          <w:p>
+            <w:pPr>
+              <w:spacing w:after="40" w:line="252"/>
+            </w:pPr>
+            <w:r>
+              <w:rPr>
+                <w:b w:val="false"/>
+                <w:bCs w:val="false"/>
+                <w:sz w:val="19"/>
+                <w:szCs w:val="19"/>
+              </w:rPr>
+              <w:t xml:space="preserve">Validation, entity matching, quarantine and lineage exactly as on page 2.</w:t>
+            </w:r>
+          </w:p>
+        </w:tc>
+        <w:tc>
+          <w:tcPr>
+            <w:tcW w:type="dxa" w:w="3386"/>
+            <w:tcBorders>
+              <w:top w:val="single" w:color="BFBFBF" w:sz="4"/>
+              <w:left w:val="single" w:color="BFBFBF" w:sz="4"/>
+              <w:bottom w:val="single" w:color="BFBFBF" w:sz="4"/>
+              <w:right w:val="single" w:color="BFBFBF" w:sz="4"/>
+            </w:tcBorders>
+            <w:tcMar>
+              <w:top w:type="dxa" w:w="70"/>
+              <w:left w:type="dxa" w:w="110"/>
+              <w:bottom w:type="dxa" w:w="70"/>
+              <w:right w:type="dxa" w:w="110"/>
+            </w:tcMar>
+          </w:tcPr>
+          <w:p>
+            <w:pPr>
+              <w:spacing w:after="40" w:line="252"/>
+            </w:pPr>
+            <w:r>
+              <w:rPr>
+                <w:b w:val="false"/>
+                <w:bCs w:val="false"/>
+                <w:sz w:val="19"/>
+                <w:szCs w:val="19"/>
+              </w:rPr>
+              <w:t xml:space="preserve">Real and synthetic data get identical quality treatment.</w:t>
+            </w:r>
+          </w:p>
+        </w:tc>
+      </w:tr>
+      <w:tr>
+        <w:tc>
+          <w:tcPr>
+            <w:tcW w:type="dxa" w:w="1880"/>
+            <w:tcBorders>
+              <w:top w:val="single" w:color="BFBFBF" w:sz="4"/>
+              <w:left w:val="single" w:color="BFBFBF" w:sz="4"/>
+              <w:bottom w:val="single" w:color="BFBFBF" w:sz="4"/>
+              <w:right w:val="single" w:color="BFBFBF" w:sz="4"/>
+            </w:tcBorders>
+            <w:shd w:fill="F4F6FA" w:color="auto" w:val="clear"/>
+            <w:tcMar>
+              <w:top w:type="dxa" w:w="70"/>
+              <w:left w:type="dxa" w:w="110"/>
+              <w:bottom w:type="dxa" w:w="70"/>
+              <w:right w:type="dxa" w:w="110"/>
+            </w:tcMar>
+          </w:tcPr>
+          <w:p>
+            <w:pPr>
+              <w:spacing w:after="40" w:line="252"/>
+            </w:pPr>
+            <w:r>
+              <w:rPr>
+                <w:b/>
+                <w:bCs/>
+                <w:sz w:val="19"/>
+                <w:szCs w:val="19"/>
+              </w:rPr>
+              <w:t xml:space="preserve">data_servicenow/opsintel.db</w:t>
+            </w:r>
+          </w:p>
+        </w:tc>
+        <w:tc>
+          <w:tcPr>
+            <w:tcW w:type="dxa" w:w="3760"/>
+            <w:tcBorders>
+              <w:top w:val="single" w:color="BFBFBF" w:sz="4"/>
+              <w:left w:val="single" w:color="BFBFBF" w:sz="4"/>
+              <w:bottom w:val="single" w:color="BFBFBF" w:sz="4"/>
+              <w:right w:val="single" w:color="BFBFBF" w:sz="4"/>
+            </w:tcBorders>
+            <w:shd w:fill="F4F6FA" w:color="auto" w:val="clear"/>
+            <w:tcMar>
+              <w:top w:type="dxa" w:w="70"/>
+              <w:left w:type="dxa" w:w="110"/>
+              <w:bottom w:type="dxa" w:w="70"/>
+              <w:right w:type="dxa" w:w="110"/>
+            </w:tcMar>
+          </w:tcPr>
+          <w:p>
+            <w:pPr>
+              <w:spacing w:after="40" w:line="252"/>
+            </w:pPr>
+            <w:r>
+              <w:rPr>
+                <w:b w:val="false"/>
+                <w:bCs w:val="false"/>
+                <w:sz w:val="19"/>
+                <w:szCs w:val="19"/>
+              </w:rPr>
+              <w:t xml:space="preserve">A separate database.</w:t>
+            </w:r>
+          </w:p>
+        </w:tc>
+        <w:tc>
+          <w:tcPr>
+            <w:tcW w:type="dxa" w:w="3386"/>
+            <w:tcBorders>
+              <w:top w:val="single" w:color="BFBFBF" w:sz="4"/>
+              <w:left w:val="single" w:color="BFBFBF" w:sz="4"/>
+              <w:bottom w:val="single" w:color="BFBFBF" w:sz="4"/>
+              <w:right w:val="single" w:color="BFBFBF" w:sz="4"/>
+            </w:tcBorders>
+            <w:shd w:fill="F4F6FA" w:color="auto" w:val="clear"/>
+            <w:tcMar>
+              <w:top w:type="dxa" w:w="70"/>
+              <w:left w:type="dxa" w:w="110"/>
+              <w:bottom w:type="dxa" w:w="70"/>
+              <w:right w:type="dxa" w:w="110"/>
+            </w:tcMar>
+          </w:tcPr>
+          <w:p>
+            <w:pPr>
+              <w:spacing w:after="40" w:line="252"/>
+            </w:pPr>
+            <w:r>
+              <w:rPr>
+                <w:b w:val="false"/>
+                <w:bCs w:val="false"/>
+                <w:sz w:val="19"/>
+                <w:szCs w:val="19"/>
+              </w:rPr>
+              <w:t xml:space="preserve">Real and synthetic data never mix.</w:t>
+            </w:r>
+          </w:p>
+        </w:tc>
+      </w:tr>
+      <w:tr>
+        <w:tc>
+          <w:tcPr>
+            <w:tcW w:type="dxa" w:w="1880"/>
+            <w:tcBorders>
+              <w:top w:val="single" w:color="BFBFBF" w:sz="4"/>
+              <w:left w:val="single" w:color="BFBFBF" w:sz="4"/>
+              <w:bottom w:val="single" w:color="BFBFBF" w:sz="4"/>
+              <w:right w:val="single" w:color="BFBFBF" w:sz="4"/>
+            </w:tcBorders>
+            <w:tcMar>
+              <w:top w:type="dxa" w:w="70"/>
+              <w:left w:type="dxa" w:w="110"/>
+              <w:bottom w:type="dxa" w:w="70"/>
+              <w:right w:type="dxa" w:w="110"/>
+            </w:tcMar>
+          </w:tcPr>
+          <w:p>
+            <w:pPr>
+              <w:spacing w:after="40" w:line="252"/>
+            </w:pPr>
+            <w:r>
+              <w:rPr>
+                <w:b/>
+                <w:bCs/>
+                <w:sz w:val="19"/>
+                <w:szCs w:val="19"/>
+              </w:rPr>
+              <w:t xml:space="preserve">make sn-ui → :8502</w:t>
+            </w:r>
+          </w:p>
+        </w:tc>
+        <w:tc>
+          <w:tcPr>
+            <w:tcW w:type="dxa" w:w="3760"/>
+            <w:tcBorders>
+              <w:top w:val="single" w:color="BFBFBF" w:sz="4"/>
+              <w:left w:val="single" w:color="BFBFBF" w:sz="4"/>
+              <w:bottom w:val="single" w:color="BFBFBF" w:sz="4"/>
+              <w:right w:val="single" w:color="BFBFBF" w:sz="4"/>
+            </w:tcBorders>
+            <w:tcMar>
+              <w:top w:type="dxa" w:w="70"/>
+              <w:left w:type="dxa" w:w="110"/>
+              <w:bottom w:type="dxa" w:w="70"/>
+              <w:right w:type="dxa" w:w="110"/>
+            </w:tcMar>
+          </w:tcPr>
+          <w:p>
+            <w:pPr>
+              <w:spacing w:after="40" w:line="252"/>
+            </w:pPr>
+            <w:r>
+              <w:rPr>
+                <w:b w:val="false"/>
+                <w:bCs w:val="false"/>
+                <w:sz w:val="19"/>
+                <w:szCs w:val="19"/>
+              </w:rPr>
+              <w:t xml:space="preserve">The dashboard on ServiceNow data, showing the source and date range; analyses that need missing data say so.</w:t>
+            </w:r>
+          </w:p>
+        </w:tc>
+        <w:tc>
+          <w:tcPr>
+            <w:tcW w:type="dxa" w:w="3386"/>
+            <w:tcBorders>
+              <w:top w:val="single" w:color="BFBFBF" w:sz="4"/>
+              <w:left w:val="single" w:color="BFBFBF" w:sz="4"/>
+              <w:bottom w:val="single" w:color="BFBFBF" w:sz="4"/>
+              <w:right w:val="single" w:color="BFBFBF" w:sz="4"/>
+            </w:tcBorders>
+            <w:tcMar>
+              <w:top w:type="dxa" w:w="70"/>
+              <w:left w:type="dxa" w:w="110"/>
+              <w:bottom w:type="dxa" w:w="70"/>
+              <w:right w:type="dxa" w:w="110"/>
+            </w:tcMar>
+          </w:tcPr>
+          <w:p>
+            <w:pPr>
+              <w:spacing w:after="40" w:line="252"/>
+            </w:pPr>
+            <w:r>
+              <w:rPr>
+                <w:b w:val="false"/>
+                <w:bCs w:val="false"/>
+                <w:sz w:val="19"/>
+                <w:szCs w:val="19"/>
+              </w:rPr>
+              <w:t xml:space="preserve">Runs alongside the synthetic dashboard on :8501.</w:t>
+            </w:r>
+          </w:p>
+        </w:tc>
+      </w:tr>
+    </w:tbl>
+    <w:p>
+      <w:pPr>
+        <w:spacing w:after="160"/>
+      </w:pPr>
+    </w:p>
+    <w:p>
+      <w:pPr>
+        <w:pStyle w:val="Heading2"/>
+      </w:pPr>
+      <w:r>
+        <w:t xml:space="preserve">Right - lessons from a real instance (decisions)</w:t>
+      </w:r>
+    </w:p>
+    <w:tbl>
+      <w:tblPr>
+        <w:tblW w:type="dxa" w:w="9026"/>
+        <w:tblBorders>
+          <w:top w:val="single" w:color="auto" w:sz="4"/>
+          <w:left w:val="single" w:color="auto" w:sz="4"/>
+          <w:bottom w:val="single" w:color="auto" w:sz="4"/>
+          <w:right w:val="single" w:color="auto" w:sz="4"/>
+          <w:insideH w:val="single" w:color="auto" w:sz="4"/>
+          <w:insideV w:val="single" w:color="auto" w:sz="4"/>
+        </w:tblBorders>
+      </w:tblPr>
+      <w:tblGrid>
+        <w:gridCol w:w="2090"/>
+        <w:gridCol w:w="2850"/>
+        <w:gridCol w:w="4086"/>
+      </w:tblGrid>
+      <w:tr>
+        <w:trPr>
+          <w:tblHeader/>
+        </w:trPr>
+        <w:tc>
+          <w:tcPr>
+            <w:tcW w:type="dxa" w:w="2090"/>
+            <w:tcBorders>
+              <w:top w:val="single" w:color="BFBFBF" w:sz="4"/>
+              <w:left w:val="single" w:color="BFBFBF" w:sz="4"/>
+              <w:bottom w:val="single" w:color="BFBFBF" w:sz="4"/>
+              <w:right w:val="single" w:color="BFBFBF" w:sz="4"/>
+            </w:tcBorders>
+            <w:shd w:fill="7B2C2C" w:color="auto" w:val="clear"/>
+            <w:tcMar>
+              <w:top w:type="dxa" w:w="70"/>
+              <w:left w:type="dxa" w:w="110"/>
+              <w:bottom w:type="dxa" w:w="70"/>
+              <w:right w:type="dxa" w:w="110"/>
+            </w:tcMar>
+          </w:tcPr>
+          <w:p>
+            <w:r>
+              <w:rPr>
+                <w:b/>
+                <w:bCs/>
+                <w:color w:val="FFFFFF"/>
+                <w:sz w:val="19"/>
+                <w:szCs w:val="19"/>
+              </w:rPr>
+              <w:t xml:space="preserve">Decision point</w:t>
+            </w:r>
+          </w:p>
+        </w:tc>
+        <w:tc>
+          <w:tcPr>
+            <w:tcW w:type="dxa" w:w="2850"/>
+            <w:tcBorders>
+              <w:top w:val="single" w:color="BFBFBF" w:sz="4"/>
+              <w:left w:val="single" w:color="BFBFBF" w:sz="4"/>
+              <w:bottom w:val="single" w:color="BFBFBF" w:sz="4"/>
+              <w:right w:val="single" w:color="BFBFBF" w:sz="4"/>
+            </w:tcBorders>
+            <w:shd w:fill="7B2C2C" w:color="auto" w:val="clear"/>
+            <w:tcMar>
+              <w:top w:type="dxa" w:w="70"/>
+              <w:left w:type="dxa" w:w="110"/>
+              <w:bottom w:type="dxa" w:w="70"/>
+              <w:right w:type="dxa" w:w="110"/>
+            </w:tcMar>
+          </w:tcPr>
+          <w:p>
+            <w:r>
+              <w:rPr>
+                <w:b/>
+                <w:bCs/>
+                <w:color w:val="FFFFFF"/>
+                <w:sz w:val="19"/>
+                <w:szCs w:val="19"/>
+              </w:rPr>
+              <w:t xml:space="preserve">Outcomes</w:t>
+            </w:r>
+          </w:p>
+        </w:tc>
+        <w:tc>
+          <w:tcPr>
+            <w:tcW w:type="dxa" w:w="4086"/>
+            <w:tcBorders>
+              <w:top w:val="single" w:color="BFBFBF" w:sz="4"/>
+              <w:left w:val="single" w:color="BFBFBF" w:sz="4"/>
+              <w:bottom w:val="single" w:color="BFBFBF" w:sz="4"/>
+              <w:right w:val="single" w:color="BFBFBF" w:sz="4"/>
+            </w:tcBorders>
+            <w:shd w:fill="7B2C2C" w:color="auto" w:val="clear"/>
+            <w:tcMar>
+              <w:top w:type="dxa" w:w="70"/>
+              <w:left w:type="dxa" w:w="110"/>
+              <w:bottom w:type="dxa" w:w="70"/>
+              <w:right w:type="dxa" w:w="110"/>
+            </w:tcMar>
+          </w:tcPr>
+          <w:p>
+            <w:r>
+              <w:rPr>
+                <w:b/>
+                <w:bCs/>
+                <w:color w:val="FFFFFF"/>
+                <w:sz w:val="19"/>
+                <w:szCs w:val="19"/>
+              </w:rPr>
+              <w:t xml:space="preserve">Why it is designed this way</w:t>
+            </w:r>
+          </w:p>
+        </w:tc>
+      </w:tr>
+      <w:tr>
+        <w:tc>
+          <w:tcPr>
+            <w:tcW w:type="dxa" w:w="2090"/>
+            <w:tcBorders>
+              <w:top w:val="single" w:color="BFBFBF" w:sz="4"/>
+              <w:left w:val="single" w:color="BFBFBF" w:sz="4"/>
+              <w:bottom w:val="single" w:color="BFBFBF" w:sz="4"/>
+              <w:right w:val="single" w:color="BFBFBF" w:sz="4"/>
+            </w:tcBorders>
+            <w:tcMar>
+              <w:top w:type="dxa" w:w="70"/>
+              <w:left w:type="dxa" w:w="110"/>
+              <w:bottom w:type="dxa" w:w="70"/>
+              <w:right w:type="dxa" w:w="110"/>
+            </w:tcMar>
+          </w:tcPr>
+          <w:p>
+            <w:pPr>
+              <w:spacing w:after="40" w:line="252"/>
+            </w:pPr>
+            <w:r>
+              <w:rPr>
+                <w:b/>
+                <w:bCs/>
+                <w:sz w:val="19"/>
+                <w:szCs w:val="19"/>
+              </w:rPr>
+              <w:t xml:space="preserve">Basic auth refused (401) - even for admin</w:t>
+            </w:r>
+          </w:p>
+        </w:tc>
+        <w:tc>
+          <w:tcPr>
+            <w:tcW w:type="dxa" w:w="2850"/>
+            <w:tcBorders>
+              <w:top w:val="single" w:color="BFBFBF" w:sz="4"/>
+              <w:left w:val="single" w:color="BFBFBF" w:sz="4"/>
+              <w:bottom w:val="single" w:color="BFBFBF" w:sz="4"/>
+              <w:right w:val="single" w:color="BFBFBF" w:sz="4"/>
+            </w:tcBorders>
+            <w:tcMar>
+              <w:top w:type="dxa" w:w="70"/>
+              <w:left w:type="dxa" w:w="110"/>
+              <w:bottom w:type="dxa" w:w="70"/>
+              <w:right w:type="dxa" w:w="110"/>
+            </w:tcMar>
+          </w:tcPr>
+          <w:p>
+            <w:pPr>
+              <w:spacing w:after="40" w:line="252"/>
+            </w:pPr>
+            <w:r>
+              <w:rPr>
+                <w:b w:val="false"/>
+                <w:bCs w:val="false"/>
+                <w:sz w:val="19"/>
+                <w:szCs w:val="19"/>
+              </w:rPr>
+              <w:t xml:space="preserve">Added OAuth 2.0 client-credentials support to the connector; basic auth kept for instances that allow it.</w:t>
+            </w:r>
+          </w:p>
+        </w:tc>
+        <w:tc>
+          <w:tcPr>
+            <w:tcW w:type="dxa" w:w="4086"/>
+            <w:tcBorders>
+              <w:top w:val="single" w:color="BFBFBF" w:sz="4"/>
+              <w:left w:val="single" w:color="BFBFBF" w:sz="4"/>
+              <w:bottom w:val="single" w:color="BFBFBF" w:sz="4"/>
+              <w:right w:val="single" w:color="BFBFBF" w:sz="4"/>
+            </w:tcBorders>
+            <w:tcMar>
+              <w:top w:type="dxa" w:w="70"/>
+              <w:left w:type="dxa" w:w="110"/>
+              <w:bottom w:type="dxa" w:w="70"/>
+              <w:right w:type="dxa" w:w="110"/>
+            </w:tcMar>
+          </w:tcPr>
+          <w:p>
+            <w:pPr>
+              <w:spacing w:after="40" w:line="252"/>
+            </w:pPr>
+            <w:r>
+              <w:rPr>
+                <w:b w:val="false"/>
+                <w:bCs w:val="false"/>
+                <w:sz w:val="19"/>
+                <w:szCs w:val="19"/>
+              </w:rPr>
+              <w:t xml:space="preserve">Recent releases block password authentication on REST APIs by default, so a ServiceNow integration should plan for OAuth from day one.</w:t>
+            </w:r>
+          </w:p>
+        </w:tc>
+      </w:tr>
+      <w:tr>
+        <w:tc>
+          <w:tcPr>
+            <w:tcW w:type="dxa" w:w="2090"/>
+            <w:tcBorders>
+              <w:top w:val="single" w:color="BFBFBF" w:sz="4"/>
+              <w:left w:val="single" w:color="BFBFBF" w:sz="4"/>
+              <w:bottom w:val="single" w:color="BFBFBF" w:sz="4"/>
+              <w:right w:val="single" w:color="BFBFBF" w:sz="4"/>
+            </w:tcBorders>
+            <w:shd w:fill="F4F6FA" w:color="auto" w:val="clear"/>
+            <w:tcMar>
+              <w:top w:type="dxa" w:w="70"/>
+              <w:left w:type="dxa" w:w="110"/>
+              <w:bottom w:type="dxa" w:w="70"/>
+              <w:right w:type="dxa" w:w="110"/>
+            </w:tcMar>
+          </w:tcPr>
+          <w:p>
+            <w:pPr>
+              <w:spacing w:after="40" w:line="252"/>
+            </w:pPr>
+            <w:r>
+              <w:rPr>
+                <w:b/>
+                <w:bCs/>
+                <w:sz w:val="19"/>
+                <w:szCs w:val="19"/>
+              </w:rPr>
+              <w:t xml:space="preserve">Token request: access_denied</w:t>
+            </w:r>
+          </w:p>
+        </w:tc>
+        <w:tc>
+          <w:tcPr>
+            <w:tcW w:type="dxa" w:w="2850"/>
+            <w:tcBorders>
+              <w:top w:val="single" w:color="BFBFBF" w:sz="4"/>
+              <w:left w:val="single" w:color="BFBFBF" w:sz="4"/>
+              <w:bottom w:val="single" w:color="BFBFBF" w:sz="4"/>
+              <w:right w:val="single" w:color="BFBFBF" w:sz="4"/>
+            </w:tcBorders>
+            <w:shd w:fill="F4F6FA" w:color="auto" w:val="clear"/>
+            <w:tcMar>
+              <w:top w:type="dxa" w:w="70"/>
+              <w:left w:type="dxa" w:w="110"/>
+              <w:bottom w:type="dxa" w:w="70"/>
+              <w:right w:type="dxa" w:w="110"/>
+            </w:tcMar>
+          </w:tcPr>
+          <w:p>
+            <w:pPr>
+              <w:spacing w:after="40" w:line="252"/>
+            </w:pPr>
+            <w:r>
+              <w:rPr>
+                <w:b w:val="false"/>
+                <w:bCs w:val="false"/>
+                <w:sz w:val="19"/>
+                <w:szCs w:val="19"/>
+              </w:rPr>
+              <w:t xml:space="preserve">Created the client-credentials system property.</w:t>
+            </w:r>
+          </w:p>
+        </w:tc>
+        <w:tc>
+          <w:tcPr>
+            <w:tcW w:type="dxa" w:w="4086"/>
+            <w:tcBorders>
+              <w:top w:val="single" w:color="BFBFBF" w:sz="4"/>
+              <w:left w:val="single" w:color="BFBFBF" w:sz="4"/>
+              <w:bottom w:val="single" w:color="BFBFBF" w:sz="4"/>
+              <w:right w:val="single" w:color="BFBFBF" w:sz="4"/>
+            </w:tcBorders>
+            <w:shd w:fill="F4F6FA" w:color="auto" w:val="clear"/>
+            <w:tcMar>
+              <w:top w:type="dxa" w:w="70"/>
+              <w:left w:type="dxa" w:w="110"/>
+              <w:bottom w:type="dxa" w:w="70"/>
+              <w:right w:type="dxa" w:w="110"/>
+            </w:tcMar>
+          </w:tcPr>
+          <w:p>
+            <w:pPr>
+              <w:spacing w:after="40" w:line="252"/>
+            </w:pPr>
+            <w:r>
+              <w:rPr>
+                <w:b w:val="false"/>
+                <w:bCs w:val="false"/>
+                <w:sz w:val="19"/>
+                <w:szCs w:val="19"/>
+              </w:rPr>
+              <w:t xml:space="preserve">The grant type is disabled until that property exists; the console only mentions it in a collapsed notice.</w:t>
+            </w:r>
+          </w:p>
+        </w:tc>
+      </w:tr>
+      <w:tr>
+        <w:tc>
+          <w:tcPr>
+            <w:tcW w:type="dxa" w:w="2090"/>
+            <w:tcBorders>
+              <w:top w:val="single" w:color="BFBFBF" w:sz="4"/>
+              <w:left w:val="single" w:color="BFBFBF" w:sz="4"/>
+              <w:bottom w:val="single" w:color="BFBFBF" w:sz="4"/>
+              <w:right w:val="single" w:color="BFBFBF" w:sz="4"/>
+            </w:tcBorders>
+            <w:tcMar>
+              <w:top w:type="dxa" w:w="70"/>
+              <w:left w:type="dxa" w:w="110"/>
+              <w:bottom w:type="dxa" w:w="70"/>
+              <w:right w:type="dxa" w:w="110"/>
+            </w:tcMar>
+          </w:tcPr>
+          <w:p>
+            <w:pPr>
+              <w:spacing w:after="40" w:line="252"/>
+            </w:pPr>
+            <w:r>
+              <w:rPr>
+                <w:b/>
+                <w:bCs/>
+                <w:sz w:val="19"/>
+                <w:szCs w:val="19"/>
+              </w:rPr>
+              <w:t xml:space="preserve">403: Access to unscoped api is not allowed</w:t>
+            </w:r>
+          </w:p>
+        </w:tc>
+        <w:tc>
+          <w:tcPr>
+            <w:tcW w:type="dxa" w:w="2850"/>
+            <w:tcBorders>
+              <w:top w:val="single" w:color="BFBFBF" w:sz="4"/>
+              <w:left w:val="single" w:color="BFBFBF" w:sz="4"/>
+              <w:bottom w:val="single" w:color="BFBFBF" w:sz="4"/>
+              <w:right w:val="single" w:color="BFBFBF" w:sz="4"/>
+            </w:tcBorders>
+            <w:tcMar>
+              <w:top w:type="dxa" w:w="70"/>
+              <w:left w:type="dxa" w:w="110"/>
+              <w:bottom w:type="dxa" w:w="70"/>
+              <w:right w:type="dxa" w:w="110"/>
+            </w:tcMar>
+          </w:tcPr>
+          <w:p>
+            <w:pPr>
+              <w:spacing w:after="40" w:line="252"/>
+            </w:pPr>
+            <w:r>
+              <w:rPr>
+                <w:b w:val="false"/>
+                <w:bCs w:val="false"/>
+                <w:sz w:val="19"/>
+                <w:szCs w:val="19"/>
+              </w:rPr>
+              <w:t xml:space="preserve">Broadened the app's token scope.</w:t>
+            </w:r>
+          </w:p>
+        </w:tc>
+        <w:tc>
+          <w:tcPr>
+            <w:tcW w:type="dxa" w:w="4086"/>
+            <w:tcBorders>
+              <w:top w:val="single" w:color="BFBFBF" w:sz="4"/>
+              <w:left w:val="single" w:color="BFBFBF" w:sz="4"/>
+              <w:bottom w:val="single" w:color="BFBFBF" w:sz="4"/>
+              <w:right w:val="single" w:color="BFBFBF" w:sz="4"/>
+            </w:tcBorders>
+            <w:tcMar>
+              <w:top w:type="dxa" w:w="70"/>
+              <w:left w:type="dxa" w:w="110"/>
+              <w:bottom w:type="dxa" w:w="70"/>
+              <w:right w:type="dxa" w:w="110"/>
+            </w:tcMar>
+          </w:tcPr>
+          <w:p>
+            <w:pPr>
+              <w:spacing w:after="40" w:line="252"/>
+            </w:pPr>
+            <w:r>
+              <w:rPr>
+                <w:b w:val="false"/>
+                <w:bCs w:val="false"/>
+                <w:sz w:val="19"/>
+                <w:szCs w:val="19"/>
+              </w:rPr>
+              <w:t xml:space="preserve">Authentication succeeded but the token was restricted to scoped APIs; the Table API is unscoped.</w:t>
+            </w:r>
+          </w:p>
+        </w:tc>
+      </w:tr>
+      <w:tr>
+        <w:tc>
+          <w:tcPr>
+            <w:tcW w:type="dxa" w:w="2090"/>
+            <w:tcBorders>
+              <w:top w:val="single" w:color="BFBFBF" w:sz="4"/>
+              <w:left w:val="single" w:color="BFBFBF" w:sz="4"/>
+              <w:bottom w:val="single" w:color="BFBFBF" w:sz="4"/>
+              <w:right w:val="single" w:color="BFBFBF" w:sz="4"/>
+            </w:tcBorders>
+            <w:shd w:fill="F4F6FA" w:color="auto" w:val="clear"/>
+            <w:tcMar>
+              <w:top w:type="dxa" w:w="70"/>
+              <w:left w:type="dxa" w:w="110"/>
+              <w:bottom w:type="dxa" w:w="70"/>
+              <w:right w:type="dxa" w:w="110"/>
+            </w:tcMar>
+          </w:tcPr>
+          <w:p>
+            <w:pPr>
+              <w:spacing w:after="40" w:line="252"/>
+            </w:pPr>
+            <w:r>
+              <w:rPr>
+                <w:b/>
+                <w:bCs/>
+                <w:sz w:val="19"/>
+                <w:szCs w:val="19"/>
+              </w:rPr>
+              <w:t xml:space="preserve">incident.problem_id missing from responses</w:t>
+            </w:r>
+          </w:p>
+        </w:tc>
+        <w:tc>
+          <w:tcPr>
+            <w:tcW w:type="dxa" w:w="2850"/>
+            <w:tcBorders>
+              <w:top w:val="single" w:color="BFBFBF" w:sz="4"/>
+              <w:left w:val="single" w:color="BFBFBF" w:sz="4"/>
+              <w:bottom w:val="single" w:color="BFBFBF" w:sz="4"/>
+              <w:right w:val="single" w:color="BFBFBF" w:sz="4"/>
+            </w:tcBorders>
+            <w:shd w:fill="F4F6FA" w:color="auto" w:val="clear"/>
+            <w:tcMar>
+              <w:top w:type="dxa" w:w="70"/>
+              <w:left w:type="dxa" w:w="110"/>
+              <w:bottom w:type="dxa" w:w="70"/>
+              <w:right w:type="dxa" w:w="110"/>
+            </w:tcMar>
+          </w:tcPr>
+          <w:p>
+            <w:pPr>
+              <w:spacing w:after="40" w:line="252"/>
+            </w:pPr>
+            <w:r>
+              <w:rPr>
+                <w:b w:val="false"/>
+                <w:bCs w:val="false"/>
+                <w:sz w:val="19"/>
+                <w:szCs w:val="19"/>
+              </w:rPr>
+              <w:t xml:space="preserve">Root cause falls back from the linked problem to the subcategory, then the close code.</w:t>
+            </w:r>
+          </w:p>
+        </w:tc>
+        <w:tc>
+          <w:tcPr>
+            <w:tcW w:type="dxa" w:w="4086"/>
+            <w:tcBorders>
+              <w:top w:val="single" w:color="BFBFBF" w:sz="4"/>
+              <w:left w:val="single" w:color="BFBFBF" w:sz="4"/>
+              <w:bottom w:val="single" w:color="BFBFBF" w:sz="4"/>
+              <w:right w:val="single" w:color="BFBFBF" w:sz="4"/>
+            </w:tcBorders>
+            <w:shd w:fill="F4F6FA" w:color="auto" w:val="clear"/>
+            <w:tcMar>
+              <w:top w:type="dxa" w:w="70"/>
+              <w:left w:type="dxa" w:w="110"/>
+              <w:bottom w:type="dxa" w:w="70"/>
+              <w:right w:type="dxa" w:w="110"/>
+            </w:tcMar>
+          </w:tcPr>
+          <w:p>
+            <w:pPr>
+              <w:spacing w:after="40" w:line="252"/>
+            </w:pPr>
+            <w:r>
+              <w:rPr>
+                <w:b w:val="false"/>
+                <w:bCs w:val="false"/>
+                <w:sz w:val="19"/>
+                <w:szCs w:val="19"/>
+              </w:rPr>
+              <w:t xml:space="preserve">A field-level access control hides the field from the integration user. Adding a read role would expose it; that is a deliberate, reviewable choice (risk register R12).</w:t>
+            </w:r>
+          </w:p>
+        </w:tc>
+      </w:tr>
+      <w:tr>
+        <w:tc>
+          <w:tcPr>
+            <w:tcW w:type="dxa" w:w="2090"/>
+            <w:tcBorders>
+              <w:top w:val="single" w:color="BFBFBF" w:sz="4"/>
+              <w:left w:val="single" w:color="BFBFBF" w:sz="4"/>
+              <w:bottom w:val="single" w:color="BFBFBF" w:sz="4"/>
+              <w:right w:val="single" w:color="BFBFBF" w:sz="4"/>
+            </w:tcBorders>
+            <w:tcMar>
+              <w:top w:type="dxa" w:w="70"/>
+              <w:left w:type="dxa" w:w="110"/>
+              <w:bottom w:type="dxa" w:w="70"/>
+              <w:right w:type="dxa" w:w="110"/>
+            </w:tcMar>
+          </w:tcPr>
+          <w:p>
+            <w:pPr>
+              <w:spacing w:after="40" w:line="252"/>
+            </w:pPr>
+            <w:r>
+              <w:rPr>
+                <w:b/>
+                <w:bCs/>
+                <w:sz w:val="19"/>
+                <w:szCs w:val="19"/>
+              </w:rPr>
+              <w:t xml:space="preserve">66 of 67 demo incidents had no business service</w:t>
+            </w:r>
+          </w:p>
+        </w:tc>
+        <w:tc>
+          <w:tcPr>
+            <w:tcW w:type="dxa" w:w="2850"/>
+            <w:tcBorders>
+              <w:top w:val="single" w:color="BFBFBF" w:sz="4"/>
+              <w:left w:val="single" w:color="BFBFBF" w:sz="4"/>
+              <w:bottom w:val="single" w:color="BFBFBF" w:sz="4"/>
+              <w:right w:val="single" w:color="BFBFBF" w:sz="4"/>
+            </w:tcBorders>
+            <w:tcMar>
+              <w:top w:type="dxa" w:w="70"/>
+              <w:left w:type="dxa" w:w="110"/>
+              <w:bottom w:type="dxa" w:w="70"/>
+              <w:right w:type="dxa" w:w="110"/>
+            </w:tcMar>
+          </w:tcPr>
+          <w:p>
+            <w:pPr>
+              <w:spacing w:after="40" w:line="252"/>
+            </w:pPr>
+            <w:r>
+              <w:rPr>
+                <w:b w:val="false"/>
+                <w:bCs w:val="false"/>
+                <w:sz w:val="19"/>
+                <w:szCs w:val="19"/>
+              </w:rPr>
+              <w:t xml:space="preserve">Placed under 'Unassigned service' and counted in the manifest.</w:t>
+            </w:r>
+          </w:p>
+        </w:tc>
+        <w:tc>
+          <w:tcPr>
+            <w:tcW w:type="dxa" w:w="4086"/>
+            <w:tcBorders>
+              <w:top w:val="single" w:color="BFBFBF" w:sz="4"/>
+              <w:left w:val="single" w:color="BFBFBF" w:sz="4"/>
+              <w:bottom w:val="single" w:color="BFBFBF" w:sz="4"/>
+              <w:right w:val="single" w:color="BFBFBF" w:sz="4"/>
+            </w:tcBorders>
+            <w:tcMar>
+              <w:top w:type="dxa" w:w="70"/>
+              <w:left w:type="dxa" w:w="110"/>
+              <w:bottom w:type="dxa" w:w="70"/>
+              <w:right w:type="dxa" w:w="110"/>
+            </w:tcMar>
+          </w:tcPr>
+          <w:p>
+            <w:pPr>
+              <w:spacing w:after="40" w:line="252"/>
+            </w:pPr>
+            <w:r>
+              <w:rPr>
+                <w:b w:val="false"/>
+                <w:bCs w:val="false"/>
+                <w:sz w:val="19"/>
+                <w:szCs w:val="19"/>
+              </w:rPr>
+              <w:t xml:space="preserve">A genuine real-world finding: service attribution is often missing, which limits service-level reporting until it is fixed at source.</w:t>
+            </w:r>
+          </w:p>
+        </w:tc>
+      </w:tr>
+      <w:tr>
+        <w:tc>
+          <w:tcPr>
+            <w:tcW w:type="dxa" w:w="2090"/>
+            <w:tcBorders>
+              <w:top w:val="single" w:color="BFBFBF" w:sz="4"/>
+              <w:left w:val="single" w:color="BFBFBF" w:sz="4"/>
+              <w:bottom w:val="single" w:color="BFBFBF" w:sz="4"/>
+              <w:right w:val="single" w:color="BFBFBF" w:sz="4"/>
+            </w:tcBorders>
+            <w:shd w:fill="F4F6FA" w:color="auto" w:val="clear"/>
+            <w:tcMar>
+              <w:top w:type="dxa" w:w="70"/>
+              <w:left w:type="dxa" w:w="110"/>
+              <w:bottom w:type="dxa" w:w="70"/>
+              <w:right w:type="dxa" w:w="110"/>
+            </w:tcMar>
+          </w:tcPr>
+          <w:p>
+            <w:pPr>
+              <w:spacing w:after="40" w:line="252"/>
+            </w:pPr>
+            <w:r>
+              <w:rPr>
+                <w:b/>
+                <w:bCs/>
+                <w:sz w:val="19"/>
+                <w:szCs w:val="19"/>
+              </w:rPr>
+              <w:t xml:space="preserve">Too little history for analytics</w:t>
+            </w:r>
+          </w:p>
+        </w:tc>
+        <w:tc>
+          <w:tcPr>
+            <w:tcW w:type="dxa" w:w="2850"/>
+            <w:tcBorders>
+              <w:top w:val="single" w:color="BFBFBF" w:sz="4"/>
+              <w:left w:val="single" w:color="BFBFBF" w:sz="4"/>
+              <w:bottom w:val="single" w:color="BFBFBF" w:sz="4"/>
+              <w:right w:val="single" w:color="BFBFBF" w:sz="4"/>
+            </w:tcBorders>
+            <w:shd w:fill="F4F6FA" w:color="auto" w:val="clear"/>
+            <w:tcMar>
+              <w:top w:type="dxa" w:w="70"/>
+              <w:left w:type="dxa" w:w="110"/>
+              <w:bottom w:type="dxa" w:w="70"/>
+              <w:right w:type="dxa" w:w="110"/>
+            </w:tcMar>
+          </w:tcPr>
+          <w:p>
+            <w:pPr>
+              <w:spacing w:after="40" w:line="252"/>
+            </w:pPr>
+            <w:r>
+              <w:rPr>
+                <w:b w:val="false"/>
+                <w:bCs w:val="false"/>
+                <w:sz w:val="19"/>
+                <w:szCs w:val="19"/>
+              </w:rPr>
+              <w:t xml:space="preserve">Seeded a year of realistic history with </w:t>
+            </w:r>
+            <w:r>
+              <w:rPr>
+                <w:rFonts w:ascii="Consolas" w:cs="Consolas" w:eastAsia="Consolas" w:hAnsi="Consolas"/>
+                <w:b w:val="false"/>
+                <w:bCs w:val="false"/>
+                <w:color w:val="8B2E2E"/>
+                <w:sz w:val="19"/>
+                <w:szCs w:val="19"/>
+              </w:rPr>
+              <w:t xml:space="preserve">seed_incidents.js</w:t>
+            </w:r>
+            <w:r>
+              <w:rPr>
+                <w:b w:val="false"/>
+                <w:bCs w:val="false"/>
+                <w:sz w:val="19"/>
+                <w:szCs w:val="19"/>
+              </w:rPr>
+              <w:t xml:space="preserve">.</w:t>
+            </w:r>
+          </w:p>
+        </w:tc>
+        <w:tc>
+          <w:tcPr>
+            <w:tcW w:type="dxa" w:w="4086"/>
+            <w:tcBorders>
+              <w:top w:val="single" w:color="BFBFBF" w:sz="4"/>
+              <w:left w:val="single" w:color="BFBFBF" w:sz="4"/>
+              <w:bottom w:val="single" w:color="BFBFBF" w:sz="4"/>
+              <w:right w:val="single" w:color="BFBFBF" w:sz="4"/>
+            </w:tcBorders>
+            <w:shd w:fill="F4F6FA" w:color="auto" w:val="clear"/>
+            <w:tcMar>
+              <w:top w:type="dxa" w:w="70"/>
+              <w:left w:type="dxa" w:w="110"/>
+              <w:bottom w:type="dxa" w:w="70"/>
+              <w:right w:type="dxa" w:w="110"/>
+            </w:tcMar>
+          </w:tcPr>
+          <w:p>
+            <w:pPr>
+              <w:spacing w:after="40" w:line="252"/>
+            </w:pPr>
+            <w:r>
+              <w:rPr>
+                <w:b w:val="false"/>
+                <w:bCs w:val="false"/>
+                <w:sz w:val="19"/>
+                <w:szCs w:val="19"/>
+              </w:rPr>
+              <w:t xml:space="preserve">Developer instances ship with a few dozen old records - not enough for trends or the risk model.</w:t>
+            </w:r>
+          </w:p>
+        </w:tc>
+      </w:tr>
+    </w:tbl>
+    <w:p>
+      <w:pPr>
+        <w:spacing w:after="160"/>
+      </w:pPr>
+    </w:p>
+    <w:p>
+      <w:pPr>
+        <w:pStyle w:val="Heading2"/>
+      </w:pPr>
+      <w:r>
+        <w:t xml:space="preserve">Bottom boxes</w:t>
+      </w:r>
+    </w:p>
+    <w:tbl>
+      <w:tblPr>
+        <w:tblW w:type="dxa" w:w="9026"/>
+        <w:tblBorders>
+          <w:top w:val="single" w:color="auto" w:sz="4"/>
+          <w:left w:val="single" w:color="auto" w:sz="4"/>
+          <w:bottom w:val="single" w:color="auto" w:sz="4"/>
+          <w:right w:val="single" w:color="auto" w:sz="4"/>
+          <w:insideH w:val="single" w:color="auto" w:sz="4"/>
+          <w:insideV w:val="single" w:color="auto" w:sz="4"/>
+        </w:tblBorders>
+      </w:tblPr>
+      <w:tblGrid>
+        <w:gridCol w:w="1880"/>
+        <w:gridCol w:w="3760"/>
+        <w:gridCol w:w="3386"/>
+      </w:tblGrid>
+      <w:tr>
+        <w:trPr>
+          <w:tblHeader/>
+        </w:trPr>
+        <w:tc>
+          <w:tcPr>
+            <w:tcW w:type="dxa" w:w="1880"/>
+            <w:tcBorders>
+              <w:top w:val="single" w:color="BFBFBF" w:sz="4"/>
+              <w:left w:val="single" w:color="BFBFBF" w:sz="4"/>
+              <w:bottom w:val="single" w:color="BFBFBF" w:sz="4"/>
+              <w:right w:val="single" w:color="BFBFBF" w:sz="4"/>
+            </w:tcBorders>
+            <w:shd w:fill="1F3864" w:color="auto" w:val="clear"/>
+            <w:tcMar>
+              <w:top w:type="dxa" w:w="70"/>
+              <w:left w:type="dxa" w:w="110"/>
+              <w:bottom w:type="dxa" w:w="70"/>
+              <w:right w:type="dxa" w:w="110"/>
+            </w:tcMar>
+          </w:tcPr>
+          <w:p>
+            <w:r>
+              <w:rPr>
+                <w:b/>
+                <w:bCs/>
+                <w:color w:val="FFFFFF"/>
+                <w:sz w:val="19"/>
+                <w:szCs w:val="19"/>
+              </w:rPr>
+              <w:t xml:space="preserve">Block</w:t>
+            </w:r>
+          </w:p>
+        </w:tc>
+        <w:tc>
+          <w:tcPr>
+            <w:tcW w:type="dxa" w:w="3760"/>
+            <w:tcBorders>
+              <w:top w:val="single" w:color="BFBFBF" w:sz="4"/>
+              <w:left w:val="single" w:color="BFBFBF" w:sz="4"/>
+              <w:bottom w:val="single" w:color="BFBFBF" w:sz="4"/>
+              <w:right w:val="single" w:color="BFBFBF" w:sz="4"/>
+            </w:tcBorders>
+            <w:shd w:fill="1F3864" w:color="auto" w:val="clear"/>
+            <w:tcMar>
+              <w:top w:type="dxa" w:w="70"/>
+              <w:left w:type="dxa" w:w="110"/>
+              <w:bottom w:type="dxa" w:w="70"/>
+              <w:right w:type="dxa" w:w="110"/>
+            </w:tcMar>
+          </w:tcPr>
+          <w:p>
+            <w:r>
+              <w:rPr>
+                <w:b/>
+                <w:bCs/>
+                <w:color w:val="FFFFFF"/>
+                <w:sz w:val="19"/>
+                <w:szCs w:val="19"/>
+              </w:rPr>
+              <w:t xml:space="preserve">What it is / what it does</w:t>
+            </w:r>
+          </w:p>
+        </w:tc>
+        <w:tc>
+          <w:tcPr>
+            <w:tcW w:type="dxa" w:w="3386"/>
+            <w:tcBorders>
+              <w:top w:val="single" w:color="BFBFBF" w:sz="4"/>
+              <w:left w:val="single" w:color="BFBFBF" w:sz="4"/>
+              <w:bottom w:val="single" w:color="BFBFBF" w:sz="4"/>
+              <w:right w:val="single" w:color="BFBFBF" w:sz="4"/>
+            </w:tcBorders>
+            <w:shd w:fill="1F3864" w:color="auto" w:val="clear"/>
+            <w:tcMar>
+              <w:top w:type="dxa" w:w="70"/>
+              <w:left w:type="dxa" w:w="110"/>
+              <w:bottom w:type="dxa" w:w="70"/>
+              <w:right w:type="dxa" w:w="110"/>
+            </w:tcMar>
+          </w:tcPr>
+          <w:p>
+            <w:r>
+              <w:rPr>
+                <w:b/>
+                <w:bCs/>
+                <w:color w:val="FFFFFF"/>
+                <w:sz w:val="19"/>
+                <w:szCs w:val="19"/>
+              </w:rPr>
+              <w:t xml:space="preserve">Design rationale &amp; where in the code</w:t>
+            </w:r>
+          </w:p>
+        </w:tc>
+      </w:tr>
+      <w:tr>
+        <w:tc>
+          <w:tcPr>
+            <w:tcW w:type="dxa" w:w="1880"/>
+            <w:tcBorders>
+              <w:top w:val="single" w:color="BFBFBF" w:sz="4"/>
+              <w:left w:val="single" w:color="BFBFBF" w:sz="4"/>
+              <w:bottom w:val="single" w:color="BFBFBF" w:sz="4"/>
+              <w:right w:val="single" w:color="BFBFBF" w:sz="4"/>
+            </w:tcBorders>
+            <w:tcMar>
+              <w:top w:type="dxa" w:w="70"/>
+              <w:left w:type="dxa" w:w="110"/>
+              <w:bottom w:type="dxa" w:w="70"/>
+              <w:right w:type="dxa" w:w="110"/>
+            </w:tcMar>
+          </w:tcPr>
+          <w:p>
+            <w:pPr>
+              <w:spacing w:after="40" w:line="252"/>
+            </w:pPr>
+            <w:r>
+              <w:rPr>
+                <w:b/>
+                <w:bCs/>
+                <w:sz w:val="19"/>
+                <w:szCs w:val="19"/>
+              </w:rPr>
+              <w:t xml:space="preserve">Seed tools (tools/servicenow/)</w:t>
+            </w:r>
+          </w:p>
+        </w:tc>
+        <w:tc>
+          <w:tcPr>
+            <w:tcW w:type="dxa" w:w="3760"/>
+            <w:tcBorders>
+              <w:top w:val="single" w:color="BFBFBF" w:sz="4"/>
+              <w:left w:val="single" w:color="BFBFBF" w:sz="4"/>
+              <w:bottom w:val="single" w:color="BFBFBF" w:sz="4"/>
+              <w:right w:val="single" w:color="BFBFBF" w:sz="4"/>
+            </w:tcBorders>
+            <w:tcMar>
+              <w:top w:type="dxa" w:w="70"/>
+              <w:left w:type="dxa" w:w="110"/>
+              <w:bottom w:type="dxa" w:w="70"/>
+              <w:right w:type="dxa" w:w="110"/>
+            </w:tcMar>
+          </w:tcPr>
+          <w:p>
+            <w:pPr>
+              <w:spacing w:after="40" w:line="252"/>
+            </w:pPr>
+            <w:r>
+              <w:rPr>
+                <w:rFonts w:ascii="Consolas" w:cs="Consolas" w:eastAsia="Consolas" w:hAnsi="Consolas"/>
+                <w:b w:val="false"/>
+                <w:bCs w:val="false"/>
+                <w:color w:val="8B2E2E"/>
+                <w:sz w:val="19"/>
+                <w:szCs w:val="19"/>
+              </w:rPr>
+              <w:t xml:space="preserve">seed_incidents.js</w:t>
+            </w:r>
+            <w:r>
+              <w:rPr>
+                <w:b w:val="false"/>
+                <w:bCs w:val="false"/>
+                <w:sz w:val="19"/>
+                <w:szCs w:val="19"/>
+              </w:rPr>
+              <w:t xml:space="preserve"> (about 1,400 incidents over 12 months on the instance's own services, CIs, groups and users, with a planted VPN problem, a September mail TLS spike and a Black Friday Retail POS peak), </w:t>
+            </w:r>
+            <w:r>
+              <w:rPr>
+                <w:rFonts w:ascii="Consolas" w:cs="Consolas" w:eastAsia="Consolas" w:hAnsi="Consolas"/>
+                <w:b w:val="false"/>
+                <w:bCs w:val="false"/>
+                <w:color w:val="8B2E2E"/>
+                <w:sz w:val="19"/>
+                <w:szCs w:val="19"/>
+              </w:rPr>
+              <w:t xml:space="preserve">link_problems.js</w:t>
+            </w:r>
+            <w:r>
+              <w:rPr>
+                <w:b w:val="false"/>
+                <w:bCs w:val="false"/>
+                <w:sz w:val="19"/>
+                <w:szCs w:val="19"/>
+              </w:rPr>
+              <w:t xml:space="preserve"> (problem records and links), </w:t>
+            </w:r>
+            <w:r>
+              <w:rPr>
+                <w:rFonts w:ascii="Consolas" w:cs="Consolas" w:eastAsia="Consolas" w:hAnsi="Consolas"/>
+                <w:b w:val="false"/>
+                <w:bCs w:val="false"/>
+                <w:color w:val="8B2E2E"/>
+                <w:sz w:val="19"/>
+                <w:szCs w:val="19"/>
+              </w:rPr>
+              <w:t xml:space="preserve">remove_seed.js</w:t>
+            </w:r>
+            <w:r>
+              <w:rPr>
+                <w:b w:val="false"/>
+                <w:bCs w:val="false"/>
+                <w:sz w:val="19"/>
+                <w:szCs w:val="19"/>
+              </w:rPr>
+              <w:t xml:space="preserve"> (dry run by default). Run as admin in *Scripts - Background*.</w:t>
+            </w:r>
+          </w:p>
+        </w:tc>
+        <w:tc>
+          <w:tcPr>
+            <w:tcW w:type="dxa" w:w="3386"/>
+            <w:tcBorders>
+              <w:top w:val="single" w:color="BFBFBF" w:sz="4"/>
+              <w:left w:val="single" w:color="BFBFBF" w:sz="4"/>
+              <w:bottom w:val="single" w:color="BFBFBF" w:sz="4"/>
+              <w:right w:val="single" w:color="BFBFBF" w:sz="4"/>
+            </w:tcBorders>
+            <w:tcMar>
+              <w:top w:type="dxa" w:w="70"/>
+              <w:left w:type="dxa" w:w="110"/>
+              <w:bottom w:type="dxa" w:w="70"/>
+              <w:right w:type="dxa" w:w="110"/>
+            </w:tcMar>
+          </w:tcPr>
+          <w:p>
+            <w:pPr>
+              <w:spacing w:after="40" w:line="252"/>
+            </w:pPr>
+            <w:r>
+              <w:rPr>
+                <w:b w:val="false"/>
+                <w:bCs w:val="false"/>
+                <w:sz w:val="19"/>
+                <w:szCs w:val="19"/>
+              </w:rPr>
+              <w:t xml:space="preserve">Every record is tagged </w:t>
+            </w:r>
+            <w:r>
+              <w:rPr>
+                <w:rFonts w:ascii="Consolas" w:cs="Consolas" w:eastAsia="Consolas" w:hAnsi="Consolas"/>
+                <w:b w:val="false"/>
+                <w:bCs w:val="false"/>
+                <w:color w:val="8B2E2E"/>
+                <w:sz w:val="19"/>
+                <w:szCs w:val="19"/>
+              </w:rPr>
+              <w:t xml:space="preserve">correlation_id = opsintel_seed</w:t>
+            </w:r>
+            <w:r>
+              <w:rPr>
+                <w:b w:val="false"/>
+                <w:bCs w:val="false"/>
+                <w:sz w:val="19"/>
+                <w:szCs w:val="19"/>
+              </w:rPr>
+              <w:t xml:space="preserve">, so the demo data is fully removable. Business rules are skipped so no notifications or SLAs fire and historical dates are kept.</w:t>
+            </w:r>
+          </w:p>
+        </w:tc>
+      </w:tr>
+      <w:tr>
+        <w:tc>
+          <w:tcPr>
+            <w:tcW w:type="dxa" w:w="1880"/>
+            <w:tcBorders>
+              <w:top w:val="single" w:color="BFBFBF" w:sz="4"/>
+              <w:left w:val="single" w:color="BFBFBF" w:sz="4"/>
+              <w:bottom w:val="single" w:color="BFBFBF" w:sz="4"/>
+              <w:right w:val="single" w:color="BFBFBF" w:sz="4"/>
+            </w:tcBorders>
+            <w:shd w:fill="F4F6FA" w:color="auto" w:val="clear"/>
+            <w:tcMar>
+              <w:top w:type="dxa" w:w="70"/>
+              <w:left w:type="dxa" w:w="110"/>
+              <w:bottom w:type="dxa" w:w="70"/>
+              <w:right w:type="dxa" w:w="110"/>
+            </w:tcMar>
+          </w:tcPr>
+          <w:p>
+            <w:pPr>
+              <w:spacing w:after="40" w:line="252"/>
+            </w:pPr>
+            <w:r>
+              <w:rPr>
+                <w:b/>
+                <w:bCs/>
+                <w:sz w:val="19"/>
+                <w:szCs w:val="19"/>
+              </w:rPr>
+              <w:t xml:space="preserve">Live result</w:t>
+            </w:r>
+          </w:p>
+        </w:tc>
+        <w:tc>
+          <w:tcPr>
+            <w:tcW w:type="dxa" w:w="3760"/>
+            <w:tcBorders>
+              <w:top w:val="single" w:color="BFBFBF" w:sz="4"/>
+              <w:left w:val="single" w:color="BFBFBF" w:sz="4"/>
+              <w:bottom w:val="single" w:color="BFBFBF" w:sz="4"/>
+              <w:right w:val="single" w:color="BFBFBF" w:sz="4"/>
+            </w:tcBorders>
+            <w:shd w:fill="F4F6FA" w:color="auto" w:val="clear"/>
+            <w:tcMar>
+              <w:top w:type="dxa" w:w="70"/>
+              <w:left w:type="dxa" w:w="110"/>
+              <w:bottom w:type="dxa" w:w="70"/>
+              <w:right w:type="dxa" w:w="110"/>
+            </w:tcMar>
+          </w:tcPr>
+          <w:p>
+            <w:pPr>
+              <w:spacing w:after="40" w:line="252"/>
+            </w:pPr>
+            <w:r>
+              <w:rPr>
+                <w:b w:val="false"/>
+                <w:bCs w:val="false"/>
+                <w:sz w:val="19"/>
+                <w:szCs w:val="19"/>
+              </w:rPr>
+              <w:t xml:space="preserve">1,474 incidents synced with 0 rejects and 0 foreign-key violations. Network breach rate 11.1% → 34.4% from Q2 to Q3 2026, driven by VPN (1 → 29 breaches); email incidents 14 → 95 from August to September. Gaps: 181 incidents without a service, 242 without a company. Cost and downtime questions answered as 'not available from this source'.</w:t>
+            </w:r>
+          </w:p>
+        </w:tc>
+        <w:tc>
+          <w:tcPr>
+            <w:tcW w:type="dxa" w:w="3386"/>
+            <w:tcBorders>
+              <w:top w:val="single" w:color="BFBFBF" w:sz="4"/>
+              <w:left w:val="single" w:color="BFBFBF" w:sz="4"/>
+              <w:bottom w:val="single" w:color="BFBFBF" w:sz="4"/>
+              <w:right w:val="single" w:color="BFBFBF" w:sz="4"/>
+            </w:tcBorders>
+            <w:shd w:fill="F4F6FA" w:color="auto" w:val="clear"/>
+            <w:tcMar>
+              <w:top w:type="dxa" w:w="70"/>
+              <w:left w:type="dxa" w:w="110"/>
+              <w:bottom w:type="dxa" w:w="70"/>
+              <w:right w:type="dxa" w:w="110"/>
+            </w:tcMar>
+          </w:tcPr>
+          <w:p>
+            <w:pPr>
+              <w:spacing w:after="40" w:line="252"/>
+            </w:pPr>
+            <w:r>
+              <w:rPr>
+                <w:b w:val="false"/>
+                <w:bCs w:val="false"/>
+                <w:sz w:val="19"/>
+                <w:szCs w:val="19"/>
+              </w:rPr>
+              <w:t xml:space="preserve">Shows the integration and the analytics work end to end on a real platform. It is not evidence about real operational performance: the data is demo plus seeded history.</w:t>
+            </w:r>
+          </w:p>
+        </w:tc>
+      </w:tr>
+    </w:tbl>
+    <w:p>
+      <w:pPr>
+        <w:spacing w:after="160"/>
+      </w:pPr>
+    </w:p>
+    <w:p>
+      <w:pPr>
+        <w:pStyle w:val="Heading1"/>
+        <w:pageBreakBefore/>
+      </w:pPr>
+      <w:r>
         <w:t xml:space="preserve">Glossary</w:t>
       </w:r>
     </w:p>
@@ -30894,7 +34127,7 @@
                 <w:sz w:val="19"/>
                 <w:szCs w:val="19"/>
               </w:rPr>
-              <w:t xml:space="preserve">Grounding</w:t>
+              <w:t xml:space="preserve">Client credentials (OAuth)</w:t>
             </w:r>
           </w:p>
         </w:tc>
@@ -30925,7 +34158,7 @@
                 <w:sz w:val="19"/>
                 <w:szCs w:val="19"/>
               </w:rPr>
-              <w:t xml:space="preserve">Whether each figure in an answer can be traced to a number in the evidence.</w:t>
+              <w:t xml:space="preserve">A machine-to-machine OAuth flow: an application exchanges its id and secret for an access token, with no user password.</w:t>
             </w:r>
           </w:p>
         </w:tc>
@@ -30959,7 +34192,7 @@
                 <w:sz w:val="19"/>
                 <w:szCs w:val="19"/>
               </w:rPr>
-              <w:t xml:space="preserve">Indirect prompt injection</w:t>
+              <w:t xml:space="preserve">Field ACL</w:t>
             </w:r>
           </w:p>
         </w:tc>
@@ -30991,7 +34224,7 @@
                 <w:sz w:val="19"/>
                 <w:szCs w:val="19"/>
               </w:rPr>
-              <w:t xml:space="preserve">Instructions hidden in data the AI reads (documents, ticket text) that try to change its behaviour.</w:t>
+              <w:t xml:space="preserve">A ServiceNow access-control rule on a single field; it can hide that field from some users even when the table is readable.</w:t>
             </w:r>
           </w:p>
         </w:tc>
@@ -31024,7 +34257,7 @@
                 <w:sz w:val="19"/>
                 <w:szCs w:val="19"/>
               </w:rPr>
-              <w:t xml:space="preserve">Isolation Forest</w:t>
+              <w:t xml:space="preserve">Grounding</w:t>
             </w:r>
           </w:p>
         </w:tc>
@@ -31055,7 +34288,7 @@
                 <w:sz w:val="19"/>
                 <w:szCs w:val="19"/>
               </w:rPr>
-              <w:t xml:space="preserve">An anomaly-detection algorithm that isolates unusual points with fewer random splits.</w:t>
+              <w:t xml:space="preserve">Whether each figure in an answer can be traced to a number in the evidence.</w:t>
             </w:r>
           </w:p>
         </w:tc>
@@ -31089,7 +34322,7 @@
                 <w:sz w:val="19"/>
                 <w:szCs w:val="19"/>
               </w:rPr>
-              <w:t xml:space="preserve">Lineage</w:t>
+              <w:t xml:space="preserve">Indirect prompt injection</w:t>
             </w:r>
           </w:p>
         </w:tc>
@@ -31121,7 +34354,7 @@
                 <w:sz w:val="19"/>
                 <w:szCs w:val="19"/>
               </w:rPr>
-              <w:t xml:space="preserve">The recorded path from source file to loaded table, including every transform.</w:t>
+              <w:t xml:space="preserve">Instructions hidden in data the AI reads (documents, ticket text) that try to change its behaviour.</w:t>
             </w:r>
           </w:p>
         </w:tc>
@@ -31154,7 +34387,7 @@
                 <w:sz w:val="19"/>
                 <w:szCs w:val="19"/>
               </w:rPr>
-              <w:t xml:space="preserve">MTTR</w:t>
+              <w:t xml:space="preserve">Isolation Forest</w:t>
             </w:r>
           </w:p>
         </w:tc>
@@ -31185,7 +34418,7 @@
                 <w:sz w:val="19"/>
                 <w:szCs w:val="19"/>
               </w:rPr>
-              <w:t xml:space="preserve">Mean time to resolve, in hours.</w:t>
+              <w:t xml:space="preserve">An anomaly-detection algorithm that isolates unusual points with fewer random splits.</w:t>
             </w:r>
           </w:p>
         </w:tc>
@@ -31219,7 +34452,7 @@
                 <w:sz w:val="19"/>
                 <w:szCs w:val="19"/>
               </w:rPr>
-              <w:t xml:space="preserve">PII</w:t>
+              <w:t xml:space="preserve">Lineage</w:t>
             </w:r>
           </w:p>
         </w:tc>
@@ -31251,7 +34484,7 @@
                 <w:sz w:val="19"/>
                 <w:szCs w:val="19"/>
               </w:rPr>
-              <w:t xml:space="preserve">Personally identifiable information (personal data).</w:t>
+              <w:t xml:space="preserve">The recorded path from source file to loaded table, including every transform.</w:t>
             </w:r>
           </w:p>
         </w:tc>
@@ -31284,7 +34517,7 @@
                 <w:sz w:val="19"/>
                 <w:szCs w:val="19"/>
               </w:rPr>
-              <w:t xml:space="preserve">RAG</w:t>
+              <w:t xml:space="preserve">MTTR</w:t>
             </w:r>
           </w:p>
         </w:tc>
@@ -31315,7 +34548,7 @@
                 <w:sz w:val="19"/>
                 <w:szCs w:val="19"/>
               </w:rPr>
-              <w:t xml:space="preserve">Retrieval-augmented generation: giving the model retrieved documents to answer from.</w:t>
+              <w:t xml:space="preserve">Mean time to resolve, in hours.</w:t>
             </w:r>
           </w:p>
         </w:tc>
@@ -31349,7 +34582,7 @@
                 <w:sz w:val="19"/>
                 <w:szCs w:val="19"/>
               </w:rPr>
-              <w:t xml:space="preserve">RLS</w:t>
+              <w:t xml:space="preserve">PII</w:t>
             </w:r>
           </w:p>
         </w:tc>
@@ -31381,7 +34614,7 @@
                 <w:sz w:val="19"/>
                 <w:szCs w:val="19"/>
               </w:rPr>
-              <w:t xml:space="preserve">Row-level security in PostgreSQL.</w:t>
+              <w:t xml:space="preserve">Personally identifiable information (personal data).</w:t>
             </w:r>
           </w:p>
         </w:tc>
@@ -31414,7 +34647,7 @@
                 <w:sz w:val="19"/>
                 <w:szCs w:val="19"/>
               </w:rPr>
-              <w:t xml:space="preserve">Segregation of duties</w:t>
+              <w:t xml:space="preserve">RAG</w:t>
             </w:r>
           </w:p>
         </w:tc>
@@ -31445,7 +34678,7 @@
                 <w:sz w:val="19"/>
                 <w:szCs w:val="19"/>
               </w:rPr>
-              <w:t xml:space="preserve">The person who proposes an action cannot approve it.</w:t>
+              <w:t xml:space="preserve">Retrieval-augmented generation: giving the model retrieved documents to answer from.</w:t>
             </w:r>
           </w:p>
         </w:tc>
@@ -31479,6 +34712,221 @@
                 <w:sz w:val="19"/>
                 <w:szCs w:val="19"/>
               </w:rPr>
+              <w:t xml:space="preserve">RLS</w:t>
+            </w:r>
+          </w:p>
+        </w:tc>
+        <w:tc>
+          <w:tcPr>
+            <w:tcW w:type="dxa" w:w="6820"/>
+            <w:tcBorders>
+              <w:top w:val="single" w:color="BFBFBF" w:sz="4"/>
+              <w:left w:val="single" w:color="BFBFBF" w:sz="4"/>
+              <w:bottom w:val="single" w:color="BFBFBF" w:sz="4"/>
+              <w:right w:val="single" w:color="BFBFBF" w:sz="4"/>
+            </w:tcBorders>
+            <w:shd w:fill="F4F6FA" w:color="auto" w:val="clear"/>
+            <w:tcMar>
+              <w:top w:type="dxa" w:w="70"/>
+              <w:left w:type="dxa" w:w="110"/>
+              <w:bottom w:type="dxa" w:w="70"/>
+              <w:right w:type="dxa" w:w="110"/>
+            </w:tcMar>
+          </w:tcPr>
+          <w:p>
+            <w:pPr>
+              <w:spacing w:after="40" w:line="252"/>
+            </w:pPr>
+            <w:r>
+              <w:rPr>
+                <w:b w:val="false"/>
+                <w:bCs w:val="false"/>
+                <w:sz w:val="19"/>
+                <w:szCs w:val="19"/>
+              </w:rPr>
+              <w:t xml:space="preserve">Row-level security in PostgreSQL.</w:t>
+            </w:r>
+          </w:p>
+        </w:tc>
+      </w:tr>
+      <w:tr>
+        <w:tc>
+          <w:tcPr>
+            <w:tcW w:type="dxa" w:w="2206"/>
+            <w:tcBorders>
+              <w:top w:val="single" w:color="BFBFBF" w:sz="4"/>
+              <w:left w:val="single" w:color="BFBFBF" w:sz="4"/>
+              <w:bottom w:val="single" w:color="BFBFBF" w:sz="4"/>
+              <w:right w:val="single" w:color="BFBFBF" w:sz="4"/>
+            </w:tcBorders>
+            <w:tcMar>
+              <w:top w:type="dxa" w:w="70"/>
+              <w:left w:type="dxa" w:w="110"/>
+              <w:bottom w:type="dxa" w:w="70"/>
+              <w:right w:type="dxa" w:w="110"/>
+            </w:tcMar>
+          </w:tcPr>
+          <w:p>
+            <w:pPr>
+              <w:spacing w:after="40" w:line="252"/>
+            </w:pPr>
+            <w:r>
+              <w:rPr>
+                <w:b/>
+                <w:bCs/>
+                <w:sz w:val="19"/>
+                <w:szCs w:val="19"/>
+              </w:rPr>
+              <w:t xml:space="preserve">Segregation of duties</w:t>
+            </w:r>
+          </w:p>
+        </w:tc>
+        <w:tc>
+          <w:tcPr>
+            <w:tcW w:type="dxa" w:w="6820"/>
+            <w:tcBorders>
+              <w:top w:val="single" w:color="BFBFBF" w:sz="4"/>
+              <w:left w:val="single" w:color="BFBFBF" w:sz="4"/>
+              <w:bottom w:val="single" w:color="BFBFBF" w:sz="4"/>
+              <w:right w:val="single" w:color="BFBFBF" w:sz="4"/>
+            </w:tcBorders>
+            <w:tcMar>
+              <w:top w:type="dxa" w:w="70"/>
+              <w:left w:type="dxa" w:w="110"/>
+              <w:bottom w:type="dxa" w:w="70"/>
+              <w:right w:type="dxa" w:w="110"/>
+            </w:tcMar>
+          </w:tcPr>
+          <w:p>
+            <w:pPr>
+              <w:spacing w:after="40" w:line="252"/>
+            </w:pPr>
+            <w:r>
+              <w:rPr>
+                <w:b w:val="false"/>
+                <w:bCs w:val="false"/>
+                <w:sz w:val="19"/>
+                <w:szCs w:val="19"/>
+              </w:rPr>
+              <w:t xml:space="preserve">The person who proposes an action cannot approve it.</w:t>
+            </w:r>
+          </w:p>
+        </w:tc>
+      </w:tr>
+      <w:tr>
+        <w:tc>
+          <w:tcPr>
+            <w:tcW w:type="dxa" w:w="2206"/>
+            <w:tcBorders>
+              <w:top w:val="single" w:color="BFBFBF" w:sz="4"/>
+              <w:left w:val="single" w:color="BFBFBF" w:sz="4"/>
+              <w:bottom w:val="single" w:color="BFBFBF" w:sz="4"/>
+              <w:right w:val="single" w:color="BFBFBF" w:sz="4"/>
+            </w:tcBorders>
+            <w:shd w:fill="F4F6FA" w:color="auto" w:val="clear"/>
+            <w:tcMar>
+              <w:top w:type="dxa" w:w="70"/>
+              <w:left w:type="dxa" w:w="110"/>
+              <w:bottom w:type="dxa" w:w="70"/>
+              <w:right w:type="dxa" w:w="110"/>
+            </w:tcMar>
+          </w:tcPr>
+          <w:p>
+            <w:pPr>
+              <w:spacing w:after="40" w:line="252"/>
+            </w:pPr>
+            <w:r>
+              <w:rPr>
+                <w:b/>
+                <w:bCs/>
+                <w:sz w:val="19"/>
+                <w:szCs w:val="19"/>
+              </w:rPr>
+              <w:t xml:space="preserve">Table API</w:t>
+            </w:r>
+          </w:p>
+        </w:tc>
+        <w:tc>
+          <w:tcPr>
+            <w:tcW w:type="dxa" w:w="6820"/>
+            <w:tcBorders>
+              <w:top w:val="single" w:color="BFBFBF" w:sz="4"/>
+              <w:left w:val="single" w:color="BFBFBF" w:sz="4"/>
+              <w:bottom w:val="single" w:color="BFBFBF" w:sz="4"/>
+              <w:right w:val="single" w:color="BFBFBF" w:sz="4"/>
+            </w:tcBorders>
+            <w:shd w:fill="F4F6FA" w:color="auto" w:val="clear"/>
+            <w:tcMar>
+              <w:top w:type="dxa" w:w="70"/>
+              <w:left w:type="dxa" w:w="110"/>
+              <w:bottom w:type="dxa" w:w="70"/>
+              <w:right w:type="dxa" w:w="110"/>
+            </w:tcMar>
+          </w:tcPr>
+          <w:p>
+            <w:pPr>
+              <w:spacing w:after="40" w:line="252"/>
+            </w:pPr>
+            <w:r>
+              <w:rPr>
+                <w:b w:val="false"/>
+                <w:bCs w:val="false"/>
+                <w:sz w:val="19"/>
+                <w:szCs w:val="19"/>
+              </w:rPr>
+              <w:t xml:space="preserve">ServiceNow's REST interface for reading and writing records in any table (</w:t>
+            </w:r>
+            <w:r>
+              <w:rPr>
+                <w:rFonts w:ascii="Consolas" w:cs="Consolas" w:eastAsia="Consolas" w:hAnsi="Consolas"/>
+                <w:b w:val="false"/>
+                <w:bCs w:val="false"/>
+                <w:color w:val="8B2E2E"/>
+                <w:sz w:val="19"/>
+                <w:szCs w:val="19"/>
+              </w:rPr>
+              <w:t xml:space="preserve">/api/now/table/{table}</w:t>
+            </w:r>
+            <w:r>
+              <w:rPr>
+                <w:b w:val="false"/>
+                <w:bCs w:val="false"/>
+                <w:sz w:val="19"/>
+                <w:szCs w:val="19"/>
+              </w:rPr>
+              <w:t xml:space="preserve">).</w:t>
+            </w:r>
+          </w:p>
+        </w:tc>
+      </w:tr>
+      <w:tr>
+        <w:tc>
+          <w:tcPr>
+            <w:tcW w:type="dxa" w:w="2206"/>
+            <w:tcBorders>
+              <w:top w:val="single" w:color="BFBFBF" w:sz="4"/>
+              <w:left w:val="single" w:color="BFBFBF" w:sz="4"/>
+              <w:bottom w:val="single" w:color="BFBFBF" w:sz="4"/>
+              <w:right w:val="single" w:color="BFBFBF" w:sz="4"/>
+            </w:tcBorders>
+            <w:tcMar>
+              <w:top w:type="dxa" w:w="70"/>
+              <w:left w:type="dxa" w:w="110"/>
+              <w:bottom w:type="dxa" w:w="70"/>
+              <w:right w:type="dxa" w:w="110"/>
+            </w:tcMar>
+          </w:tcPr>
+          <w:p>
+            <w:pPr>
+              <w:spacing w:after="40" w:line="252"/>
+            </w:pPr>
+            <w:r>
+              <w:rPr>
+                <w:b/>
+                <w:bCs/>
+                <w:sz w:val="19"/>
+                <w:szCs w:val="19"/>
+              </w:rPr>
               <w:t xml:space="preserve">SLA breach rate</w:t>
             </w:r>
           </w:p>
@@ -31492,7 +34940,6 @@
               <w:bottom w:val="single" w:color="BFBFBF" w:sz="4"/>
               <w:right w:val="single" w:color="BFBFBF" w:sz="4"/>
             </w:tcBorders>
-            <w:shd w:fill="F4F6FA" w:color="auto" w:val="clear"/>
             <w:tcMar>
               <w:top w:type="dxa" w:w="70"/>
               <w:left w:type="dxa" w:w="110"/>

</xml_diff>

<commit_message>
Restore three-condition evaluation, add screenshots, literature review, API and Unity docs
- Re-run benchmark under rules, Claude and LLM-only conditions (Claude 28/28,
  grounding 0.988); harness keeps results for engines not re-run
- README screenshot gallery (tools/capture_screenshots.py, Playwright)
- docs/literature_review.md, docs/api.md (generated from OpenAPI),
  docs/unity_poc_proposal.md, docs/analytics.md
- Endpoint summaries in the API; last quarter = last complete quarter;
  source-aware suggested questions and assistant prompt
- Correct earlier claim about incident.problem_id (field absent in this
  ServiceNow release, not hidden by an ACL)
</commit_message>
<xml_diff>
--- a/docs/diagrams/OpsIntel_Diagram_Guide.docx
+++ b/docs/diagrams/OpsIntel_Diagram_Guide.docx
@@ -32855,7 +32855,27 @@
                 <w:sz w:val="19"/>
                 <w:szCs w:val="19"/>
               </w:rPr>
-              <w:t xml:space="preserve">A field-level access control hides the field from the integration user. Adding a read role would expose it; that is a deliberate, reviewable choice (risk register R12).</w:t>
+              <w:t xml:space="preserve">This release's incident table has no </w:t>
+            </w:r>
+            <w:r>
+              <w:rPr>
+                <w:rFonts w:ascii="Consolas" w:cs="Consolas" w:eastAsia="Consolas" w:hAnsi="Consolas"/>
+                <w:b w:val="false"/>
+                <w:bCs w:val="false"/>
+                <w:color w:val="8B2E2E"/>
+                <w:sz w:val="19"/>
+                <w:szCs w:val="19"/>
+              </w:rPr>
+              <w:t xml:space="preserve">problem_id</w:t>
+            </w:r>
+            <w:r>
+              <w:rPr>
+                <w:b w:val="false"/>
+                <w:bCs w:val="false"/>
+                <w:sz w:val="19"/>
+                <w:szCs w:val="19"/>
+              </w:rPr>
+              <w:t xml:space="preserve"> field - verified in the dictionary after an extra read role made no difference. Field names change between releases, so check the dictionary before adding roles.</w:t>
             </w:r>
           </w:p>
         </w:tc>
@@ -33289,7 +33309,27 @@
                 <w:sz w:val="19"/>
                 <w:szCs w:val="19"/>
               </w:rPr>
-              <w:t xml:space="preserve"> (problem records and links), </w:t>
+              <w:t xml:space="preserve"> (problem records; links only on releases that have </w:t>
+            </w:r>
+            <w:r>
+              <w:rPr>
+                <w:rFonts w:ascii="Consolas" w:cs="Consolas" w:eastAsia="Consolas" w:hAnsi="Consolas"/>
+                <w:b w:val="false"/>
+                <w:bCs w:val="false"/>
+                <w:color w:val="8B2E2E"/>
+                <w:sz w:val="19"/>
+                <w:szCs w:val="19"/>
+              </w:rPr>
+              <w:t xml:space="preserve">incident.problem_id</w:t>
+            </w:r>
+            <w:r>
+              <w:rPr>
+                <w:b w:val="false"/>
+                <w:bCs w:val="false"/>
+                <w:sz w:val="19"/>
+                <w:szCs w:val="19"/>
+              </w:rPr>
+              <w:t xml:space="preserve">), </w:t>
             </w:r>
             <w:r>
               <w:rPr>
@@ -34192,7 +34232,7 @@
                 <w:sz w:val="19"/>
                 <w:szCs w:val="19"/>
               </w:rPr>
-              <w:t xml:space="preserve">Field ACL</w:t>
+              <w:t xml:space="preserve">Grounding</w:t>
             </w:r>
           </w:p>
         </w:tc>
@@ -34224,7 +34264,7 @@
                 <w:sz w:val="19"/>
                 <w:szCs w:val="19"/>
               </w:rPr>
-              <w:t xml:space="preserve">A ServiceNow access-control rule on a single field; it can hide that field from some users even when the table is readable.</w:t>
+              <w:t xml:space="preserve">Whether each figure in an answer can be traced to a number in the evidence.</w:t>
             </w:r>
           </w:p>
         </w:tc>
@@ -34257,7 +34297,7 @@
                 <w:sz w:val="19"/>
                 <w:szCs w:val="19"/>
               </w:rPr>
-              <w:t xml:space="preserve">Grounding</w:t>
+              <w:t xml:space="preserve">Indirect prompt injection</w:t>
             </w:r>
           </w:p>
         </w:tc>
@@ -34288,7 +34328,7 @@
                 <w:sz w:val="19"/>
                 <w:szCs w:val="19"/>
               </w:rPr>
-              <w:t xml:space="preserve">Whether each figure in an answer can be traced to a number in the evidence.</w:t>
+              <w:t xml:space="preserve">Instructions hidden in data the AI reads (documents, ticket text) that try to change its behaviour.</w:t>
             </w:r>
           </w:p>
         </w:tc>
@@ -34322,7 +34362,7 @@
                 <w:sz w:val="19"/>
                 <w:szCs w:val="19"/>
               </w:rPr>
-              <w:t xml:space="preserve">Indirect prompt injection</w:t>
+              <w:t xml:space="preserve">Isolation Forest</w:t>
             </w:r>
           </w:p>
         </w:tc>
@@ -34354,7 +34394,7 @@
                 <w:sz w:val="19"/>
                 <w:szCs w:val="19"/>
               </w:rPr>
-              <w:t xml:space="preserve">Instructions hidden in data the AI reads (documents, ticket text) that try to change its behaviour.</w:t>
+              <w:t xml:space="preserve">An anomaly-detection algorithm that isolates unusual points with fewer random splits.</w:t>
             </w:r>
           </w:p>
         </w:tc>
@@ -34387,7 +34427,7 @@
                 <w:sz w:val="19"/>
                 <w:szCs w:val="19"/>
               </w:rPr>
-              <w:t xml:space="preserve">Isolation Forest</w:t>
+              <w:t xml:space="preserve">Lineage</w:t>
             </w:r>
           </w:p>
         </w:tc>
@@ -34418,7 +34458,7 @@
                 <w:sz w:val="19"/>
                 <w:szCs w:val="19"/>
               </w:rPr>
-              <w:t xml:space="preserve">An anomaly-detection algorithm that isolates unusual points with fewer random splits.</w:t>
+              <w:t xml:space="preserve">The recorded path from source file to loaded table, including every transform.</w:t>
             </w:r>
           </w:p>
         </w:tc>
@@ -34452,7 +34492,7 @@
                 <w:sz w:val="19"/>
                 <w:szCs w:val="19"/>
               </w:rPr>
-              <w:t xml:space="preserve">Lineage</w:t>
+              <w:t xml:space="preserve">MTTR</w:t>
             </w:r>
           </w:p>
         </w:tc>
@@ -34484,7 +34524,7 @@
                 <w:sz w:val="19"/>
                 <w:szCs w:val="19"/>
               </w:rPr>
-              <w:t xml:space="preserve">The recorded path from source file to loaded table, including every transform.</w:t>
+              <w:t xml:space="preserve">Mean time to resolve, in hours.</w:t>
             </w:r>
           </w:p>
         </w:tc>
@@ -34517,7 +34557,7 @@
                 <w:sz w:val="19"/>
                 <w:szCs w:val="19"/>
               </w:rPr>
-              <w:t xml:space="preserve">MTTR</w:t>
+              <w:t xml:space="preserve">PII</w:t>
             </w:r>
           </w:p>
         </w:tc>
@@ -34548,7 +34588,7 @@
                 <w:sz w:val="19"/>
                 <w:szCs w:val="19"/>
               </w:rPr>
-              <w:t xml:space="preserve">Mean time to resolve, in hours.</w:t>
+              <w:t xml:space="preserve">Personally identifiable information (personal data).</w:t>
             </w:r>
           </w:p>
         </w:tc>
@@ -34582,7 +34622,7 @@
                 <w:sz w:val="19"/>
                 <w:szCs w:val="19"/>
               </w:rPr>
-              <w:t xml:space="preserve">PII</w:t>
+              <w:t xml:space="preserve">RAG</w:t>
             </w:r>
           </w:p>
         </w:tc>
@@ -34614,7 +34654,7 @@
                 <w:sz w:val="19"/>
                 <w:szCs w:val="19"/>
               </w:rPr>
-              <w:t xml:space="preserve">Personally identifiable information (personal data).</w:t>
+              <w:t xml:space="preserve">Retrieval-augmented generation: giving the model retrieved documents to answer from.</w:t>
             </w:r>
           </w:p>
         </w:tc>
@@ -34647,7 +34687,7 @@
                 <w:sz w:val="19"/>
                 <w:szCs w:val="19"/>
               </w:rPr>
-              <w:t xml:space="preserve">RAG</w:t>
+              <w:t xml:space="preserve">RLS</w:t>
             </w:r>
           </w:p>
         </w:tc>
@@ -34678,7 +34718,7 @@
                 <w:sz w:val="19"/>
                 <w:szCs w:val="19"/>
               </w:rPr>
-              <w:t xml:space="preserve">Retrieval-augmented generation: giving the model retrieved documents to answer from.</w:t>
+              <w:t xml:space="preserve">Row-level security in PostgreSQL.</w:t>
             </w:r>
           </w:p>
         </w:tc>
@@ -34712,7 +34752,7 @@
                 <w:sz w:val="19"/>
                 <w:szCs w:val="19"/>
               </w:rPr>
-              <w:t xml:space="preserve">RLS</w:t>
+              <w:t xml:space="preserve">Segregation of duties</w:t>
             </w:r>
           </w:p>
         </w:tc>
@@ -34744,7 +34784,7 @@
                 <w:sz w:val="19"/>
                 <w:szCs w:val="19"/>
               </w:rPr>
-              <w:t xml:space="preserve">Row-level security in PostgreSQL.</w:t>
+              <w:t xml:space="preserve">The person who proposes an action cannot approve it.</w:t>
             </w:r>
           </w:p>
         </w:tc>
@@ -34777,7 +34817,7 @@
                 <w:sz w:val="19"/>
                 <w:szCs w:val="19"/>
               </w:rPr>
-              <w:t xml:space="preserve">Segregation of duties</w:t>
+              <w:t xml:space="preserve">Table API</w:t>
             </w:r>
           </w:p>
         </w:tc>
@@ -34808,7 +34848,27 @@
                 <w:sz w:val="19"/>
                 <w:szCs w:val="19"/>
               </w:rPr>
-              <w:t xml:space="preserve">The person who proposes an action cannot approve it.</w:t>
+              <w:t xml:space="preserve">ServiceNow's REST interface for reading and writing records in any table (</w:t>
+            </w:r>
+            <w:r>
+              <w:rPr>
+                <w:rFonts w:ascii="Consolas" w:cs="Consolas" w:eastAsia="Consolas" w:hAnsi="Consolas"/>
+                <w:b w:val="false"/>
+                <w:bCs w:val="false"/>
+                <w:color w:val="8B2E2E"/>
+                <w:sz w:val="19"/>
+                <w:szCs w:val="19"/>
+              </w:rPr>
+              <w:t xml:space="preserve">/api/now/table/{table}</w:t>
+            </w:r>
+            <w:r>
+              <w:rPr>
+                <w:b w:val="false"/>
+                <w:bCs w:val="false"/>
+                <w:sz w:val="19"/>
+                <w:szCs w:val="19"/>
+              </w:rPr>
+              <w:t xml:space="preserve">).</w:t>
             </w:r>
           </w:p>
         </w:tc>
@@ -34842,7 +34902,7 @@
                 <w:sz w:val="19"/>
                 <w:szCs w:val="19"/>
               </w:rPr>
-              <w:t xml:space="preserve">Table API</w:t>
+              <w:t xml:space="preserve">SLA breach rate</w:t>
             </w:r>
           </w:p>
         </w:tc>
@@ -34856,90 +34916,6 @@
               <w:right w:val="single" w:color="BFBFBF" w:sz="4"/>
             </w:tcBorders>
             <w:shd w:fill="F4F6FA" w:color="auto" w:val="clear"/>
-            <w:tcMar>
-              <w:top w:type="dxa" w:w="70"/>
-              <w:left w:type="dxa" w:w="110"/>
-              <w:bottom w:type="dxa" w:w="70"/>
-              <w:right w:type="dxa" w:w="110"/>
-            </w:tcMar>
-          </w:tcPr>
-          <w:p>
-            <w:pPr>
-              <w:spacing w:after="40" w:line="252"/>
-            </w:pPr>
-            <w:r>
-              <w:rPr>
-                <w:b w:val="false"/>
-                <w:bCs w:val="false"/>
-                <w:sz w:val="19"/>
-                <w:szCs w:val="19"/>
-              </w:rPr>
-              <w:t xml:space="preserve">ServiceNow's REST interface for reading and writing records in any table (</w:t>
-            </w:r>
-            <w:r>
-              <w:rPr>
-                <w:rFonts w:ascii="Consolas" w:cs="Consolas" w:eastAsia="Consolas" w:hAnsi="Consolas"/>
-                <w:b w:val="false"/>
-                <w:bCs w:val="false"/>
-                <w:color w:val="8B2E2E"/>
-                <w:sz w:val="19"/>
-                <w:szCs w:val="19"/>
-              </w:rPr>
-              <w:t xml:space="preserve">/api/now/table/{table}</w:t>
-            </w:r>
-            <w:r>
-              <w:rPr>
-                <w:b w:val="false"/>
-                <w:bCs w:val="false"/>
-                <w:sz w:val="19"/>
-                <w:szCs w:val="19"/>
-              </w:rPr>
-              <w:t xml:space="preserve">).</w:t>
-            </w:r>
-          </w:p>
-        </w:tc>
-      </w:tr>
-      <w:tr>
-        <w:tc>
-          <w:tcPr>
-            <w:tcW w:type="dxa" w:w="2206"/>
-            <w:tcBorders>
-              <w:top w:val="single" w:color="BFBFBF" w:sz="4"/>
-              <w:left w:val="single" w:color="BFBFBF" w:sz="4"/>
-              <w:bottom w:val="single" w:color="BFBFBF" w:sz="4"/>
-              <w:right w:val="single" w:color="BFBFBF" w:sz="4"/>
-            </w:tcBorders>
-            <w:tcMar>
-              <w:top w:type="dxa" w:w="70"/>
-              <w:left w:type="dxa" w:w="110"/>
-              <w:bottom w:type="dxa" w:w="70"/>
-              <w:right w:type="dxa" w:w="110"/>
-            </w:tcMar>
-          </w:tcPr>
-          <w:p>
-            <w:pPr>
-              <w:spacing w:after="40" w:line="252"/>
-            </w:pPr>
-            <w:r>
-              <w:rPr>
-                <w:b/>
-                <w:bCs/>
-                <w:sz w:val="19"/>
-                <w:szCs w:val="19"/>
-              </w:rPr>
-              <w:t xml:space="preserve">SLA breach rate</w:t>
-            </w:r>
-          </w:p>
-        </w:tc>
-        <w:tc>
-          <w:tcPr>
-            <w:tcW w:type="dxa" w:w="6820"/>
-            <w:tcBorders>
-              <w:top w:val="single" w:color="BFBFBF" w:sz="4"/>
-              <w:left w:val="single" w:color="BFBFBF" w:sz="4"/>
-              <w:bottom w:val="single" w:color="BFBFBF" w:sz="4"/>
-              <w:right w:val="single" w:color="BFBFBF" w:sz="4"/>
-            </w:tcBorders>
             <w:tcMar>
               <w:top w:type="dxa" w:w="70"/>
               <w:left w:type="dxa" w:w="110"/>

</xml_diff>